<commit_message>
Final documentation: team names and IDs, light/dark design, illustrations, user guide, task sheet
Co-Authored-By: Claude Opus 5.5 <noreply@anthropic.com>
Claude-Session: https://claude.ai/code/session_01EGrnzrfHztmX7RAaosfXYG
</commit_message>
<xml_diff>
--- a/documentation/Nexus_Documentation/Nexus_User_Guide.docx
+++ b/documentation/Nexus_Documentation/Nexus_User_Guide.docx
@@ -4,7 +4,7 @@
   <w:body>
     <w:p>
       <w:pPr>
-        <w:spacing w:after="200" w:before="600"/>
+        <w:spacing w:after="200" w:before="300"/>
       </w:pPr>
       <w:r>
         <w:rPr>
@@ -55,7 +55,7 @@
       <w:r>
         <w:drawing>
           <wp:inline distT="0" distB="0" distL="0" distR="0">
-            <wp:extent cx="5334000" cy="3333750"/>
+            <wp:extent cx="4095750" cy="2562225"/>
             <wp:effectExtent t="0" r="0" b="0" l="0"/>
             <wp:docPr id="1" name="ui-login.jpg" descr="ui login jpg" title="ui-login.jpg"/>
             <wp:cNvGraphicFramePr>
@@ -80,7 +80,7 @@
                   <pic:spPr bwMode="auto">
                     <a:xfrm>
                       <a:off x="0" y="0"/>
-                      <a:ext cx="5334000" cy="3333750"/>
+                      <a:ext cx="4095750" cy="2562225"/>
                     </a:xfrm>
                     <a:prstGeom prst="rect">
                       <a:avLst/>
@@ -95,7 +95,7 @@
     </w:p>
     <w:p>
       <w:pPr>
-        <w:spacing w:after="240"/>
+        <w:spacing w:after="120"/>
       </w:pPr>
     </w:p>
     <w:tbl>
@@ -356,7 +356,7 @@
                 <w:sz w:val="19"/>
                 <w:szCs w:val="19"/>
               </w:rPr>
-              <w:t xml:space="preserve">Student name</w:t>
+              <w:t xml:space="preserve">Submission</w:t>
             </w:r>
           </w:p>
         </w:tc>
@@ -389,7 +389,128 @@
                 <w:sz w:val="19"/>
                 <w:szCs w:val="19"/>
               </w:rPr>
-              <w:t xml:space="preserve">[Your name]</w:t>
+              <w:t xml:space="preserve">October 2026</w:t>
+            </w:r>
+          </w:p>
+        </w:tc>
+      </w:tr>
+    </w:tbl>
+    <w:p>
+      <w:pPr>
+        <w:spacing w:after="160"/>
+      </w:pPr>
+    </w:p>
+    <w:tbl>
+      <w:tblPr>
+        <w:tblW w:type="dxa" w:w="9638"/>
+        <w:tblBorders>
+          <w:top w:val="single" w:color="auto" w:sz="4"/>
+          <w:left w:val="single" w:color="auto" w:sz="4"/>
+          <w:bottom w:val="single" w:color="auto" w:sz="4"/>
+          <w:right w:val="single" w:color="auto" w:sz="4"/>
+          <w:insideH w:val="single" w:color="auto" w:sz="4"/>
+          <w:insideV w:val="single" w:color="auto" w:sz="4"/>
+        </w:tblBorders>
+      </w:tblPr>
+      <w:tblGrid>
+        <w:gridCol w:w="700"/>
+        <w:gridCol w:w="5338"/>
+        <w:gridCol w:w="3600"/>
+      </w:tblGrid>
+      <w:tr>
+        <w:trPr>
+          <w:tblHeader/>
+        </w:trPr>
+        <w:tc>
+          <w:tcPr>
+            <w:tcW w:type="dxa" w:w="700"/>
+            <w:tcBorders>
+              <w:top w:val="single" w:color="CBD5E1" w:sz="4"/>
+              <w:left w:val="single" w:color="CBD5E1" w:sz="4"/>
+              <w:bottom w:val="single" w:color="CBD5E1" w:sz="4"/>
+              <w:right w:val="single" w:color="CBD5E1" w:sz="4"/>
+            </w:tcBorders>
+            <w:shd w:fill="0A2540" w:color="auto" w:val="clear"/>
+            <w:tcMar>
+              <w:top w:type="dxa" w:w="80"/>
+              <w:left w:type="dxa" w:w="110"/>
+              <w:bottom w:type="dxa" w:w="80"/>
+              <w:right w:type="dxa" w:w="110"/>
+            </w:tcMar>
+            <w:vAlign w:val="center"/>
+          </w:tcPr>
+          <w:p>
+            <w:r>
+              <w:rPr>
+                <w:b/>
+                <w:bCs/>
+                <w:color w:val="FFFFFF"/>
+                <w:sz w:val="19"/>
+                <w:szCs w:val="19"/>
+              </w:rPr>
+              <w:t xml:space="preserve">#</w:t>
+            </w:r>
+          </w:p>
+        </w:tc>
+        <w:tc>
+          <w:tcPr>
+            <w:tcW w:type="dxa" w:w="5338"/>
+            <w:tcBorders>
+              <w:top w:val="single" w:color="CBD5E1" w:sz="4"/>
+              <w:left w:val="single" w:color="CBD5E1" w:sz="4"/>
+              <w:bottom w:val="single" w:color="CBD5E1" w:sz="4"/>
+              <w:right w:val="single" w:color="CBD5E1" w:sz="4"/>
+            </w:tcBorders>
+            <w:shd w:fill="0A2540" w:color="auto" w:val="clear"/>
+            <w:tcMar>
+              <w:top w:type="dxa" w:w="80"/>
+              <w:left w:type="dxa" w:w="110"/>
+              <w:bottom w:type="dxa" w:w="80"/>
+              <w:right w:type="dxa" w:w="110"/>
+            </w:tcMar>
+            <w:vAlign w:val="center"/>
+          </w:tcPr>
+          <w:p>
+            <w:r>
+              <w:rPr>
+                <w:b/>
+                <w:bCs/>
+                <w:color w:val="FFFFFF"/>
+                <w:sz w:val="19"/>
+                <w:szCs w:val="19"/>
+              </w:rPr>
+              <w:t xml:space="preserve">Team member</w:t>
+            </w:r>
+          </w:p>
+        </w:tc>
+        <w:tc>
+          <w:tcPr>
+            <w:tcW w:type="dxa" w:w="3600"/>
+            <w:tcBorders>
+              <w:top w:val="single" w:color="CBD5E1" w:sz="4"/>
+              <w:left w:val="single" w:color="CBD5E1" w:sz="4"/>
+              <w:bottom w:val="single" w:color="CBD5E1" w:sz="4"/>
+              <w:right w:val="single" w:color="CBD5E1" w:sz="4"/>
+            </w:tcBorders>
+            <w:shd w:fill="0A2540" w:color="auto" w:val="clear"/>
+            <w:tcMar>
+              <w:top w:type="dxa" w:w="80"/>
+              <w:left w:type="dxa" w:w="110"/>
+              <w:bottom w:type="dxa" w:w="80"/>
+              <w:right w:type="dxa" w:w="110"/>
+            </w:tcMar>
+            <w:vAlign w:val="center"/>
+          </w:tcPr>
+          <w:p>
+            <w:r>
+              <w:rPr>
+                <w:b/>
+                <w:bCs/>
+                <w:color w:val="FFFFFF"/>
+                <w:sz w:val="19"/>
+                <w:szCs w:val="19"/>
+              </w:rPr>
+              <w:t xml:space="preserve">Student ID</w:t>
             </w:r>
           </w:p>
         </w:tc>
@@ -400,67 +521,100 @@
         </w:trPr>
         <w:tc>
           <w:tcPr>
-            <w:tcW w:type="dxa" w:w="2600"/>
-            <w:tcBorders>
-              <w:top w:val="single" w:color="CBD5E1" w:sz="4"/>
-              <w:left w:val="single" w:color="CBD5E1" w:sz="4"/>
-              <w:bottom w:val="single" w:color="CBD5E1" w:sz="4"/>
-              <w:right w:val="single" w:color="CBD5E1" w:sz="4"/>
-            </w:tcBorders>
-            <w:shd w:fill="F8FAFC" w:color="auto" w:val="clear"/>
-            <w:tcMar>
-              <w:top w:type="dxa" w:w="70"/>
-              <w:left w:type="dxa" w:w="110"/>
-              <w:bottom w:type="dxa" w:w="70"/>
-              <w:right w:type="dxa" w:w="110"/>
-            </w:tcMar>
-          </w:tcPr>
-          <w:p>
-            <w:pPr>
-              <w:spacing w:after="0" w:line="264"/>
-            </w:pPr>
-            <w:r>
-              <w:rPr>
-                <w:b w:val="false"/>
-                <w:bCs w:val="false"/>
-                <w:color w:val="0F172A"/>
-                <w:sz w:val="19"/>
-                <w:szCs w:val="19"/>
-              </w:rPr>
-              <w:t xml:space="preserve">Enrollment no.</w:t>
-            </w:r>
-          </w:p>
-        </w:tc>
-        <w:tc>
-          <w:tcPr>
-            <w:tcW w:type="dxa" w:w="7038"/>
-            <w:tcBorders>
-              <w:top w:val="single" w:color="CBD5E1" w:sz="4"/>
-              <w:left w:val="single" w:color="CBD5E1" w:sz="4"/>
-              <w:bottom w:val="single" w:color="CBD5E1" w:sz="4"/>
-              <w:right w:val="single" w:color="CBD5E1" w:sz="4"/>
-            </w:tcBorders>
-            <w:shd w:fill="F8FAFC" w:color="auto" w:val="clear"/>
-            <w:tcMar>
-              <w:top w:type="dxa" w:w="70"/>
-              <w:left w:type="dxa" w:w="110"/>
-              <w:bottom w:type="dxa" w:w="70"/>
-              <w:right w:type="dxa" w:w="110"/>
-            </w:tcMar>
-          </w:tcPr>
-          <w:p>
-            <w:pPr>
-              <w:spacing w:after="0" w:line="264"/>
-            </w:pPr>
-            <w:r>
-              <w:rPr>
-                <w:b w:val="false"/>
-                <w:bCs w:val="false"/>
-                <w:color w:val="0F172A"/>
-                <w:sz w:val="19"/>
-                <w:szCs w:val="19"/>
-              </w:rPr>
-              <w:t xml:space="preserve">[Your enrollment number]</w:t>
+            <w:tcW w:type="dxa" w:w="700"/>
+            <w:tcBorders>
+              <w:top w:val="single" w:color="CBD5E1" w:sz="4"/>
+              <w:left w:val="single" w:color="CBD5E1" w:sz="4"/>
+              <w:bottom w:val="single" w:color="CBD5E1" w:sz="4"/>
+              <w:right w:val="single" w:color="CBD5E1" w:sz="4"/>
+            </w:tcBorders>
+            <w:shd w:fill="FFFFFF" w:color="auto" w:val="clear"/>
+            <w:tcMar>
+              <w:top w:type="dxa" w:w="70"/>
+              <w:left w:type="dxa" w:w="110"/>
+              <w:bottom w:type="dxa" w:w="70"/>
+              <w:right w:type="dxa" w:w="110"/>
+            </w:tcMar>
+          </w:tcPr>
+          <w:p>
+            <w:pPr>
+              <w:spacing w:after="0" w:line="264"/>
+            </w:pPr>
+            <w:r>
+              <w:rPr>
+                <w:b w:val="false"/>
+                <w:bCs w:val="false"/>
+                <w:color w:val="0F172A"/>
+                <w:sz w:val="19"/>
+                <w:szCs w:val="19"/>
+              </w:rPr>
+              <w:t xml:space="preserve">1</w:t>
+            </w:r>
+          </w:p>
+        </w:tc>
+        <w:tc>
+          <w:tcPr>
+            <w:tcW w:type="dxa" w:w="5338"/>
+            <w:tcBorders>
+              <w:top w:val="single" w:color="CBD5E1" w:sz="4"/>
+              <w:left w:val="single" w:color="CBD5E1" w:sz="4"/>
+              <w:bottom w:val="single" w:color="CBD5E1" w:sz="4"/>
+              <w:right w:val="single" w:color="CBD5E1" w:sz="4"/>
+            </w:tcBorders>
+            <w:shd w:fill="FFFFFF" w:color="auto" w:val="clear"/>
+            <w:tcMar>
+              <w:top w:type="dxa" w:w="70"/>
+              <w:left w:type="dxa" w:w="110"/>
+              <w:bottom w:type="dxa" w:w="70"/>
+              <w:right w:type="dxa" w:w="110"/>
+            </w:tcMar>
+          </w:tcPr>
+          <w:p>
+            <w:pPr>
+              <w:spacing w:after="0" w:line="264"/>
+            </w:pPr>
+            <w:r>
+              <w:rPr>
+                <w:b/>
+                <w:bCs/>
+                <w:color w:val="0F172A"/>
+                <w:sz w:val="19"/>
+                <w:szCs w:val="19"/>
+              </w:rPr>
+              <w:t xml:space="preserve">Ali Jan</w:t>
+            </w:r>
+          </w:p>
+        </w:tc>
+        <w:tc>
+          <w:tcPr>
+            <w:tcW w:type="dxa" w:w="3600"/>
+            <w:tcBorders>
+              <w:top w:val="single" w:color="CBD5E1" w:sz="4"/>
+              <w:left w:val="single" w:color="CBD5E1" w:sz="4"/>
+              <w:bottom w:val="single" w:color="CBD5E1" w:sz="4"/>
+              <w:right w:val="single" w:color="CBD5E1" w:sz="4"/>
+            </w:tcBorders>
+            <w:shd w:fill="FFFFFF" w:color="auto" w:val="clear"/>
+            <w:tcMar>
+              <w:top w:type="dxa" w:w="70"/>
+              <w:left w:type="dxa" w:w="110"/>
+              <w:bottom w:type="dxa" w:w="70"/>
+              <w:right w:type="dxa" w:w="110"/>
+            </w:tcMar>
+          </w:tcPr>
+          <w:p>
+            <w:pPr>
+              <w:spacing w:after="0" w:line="264"/>
+            </w:pPr>
+            <w:r>
+              <w:rPr>
+                <w:b w:val="false"/>
+                <w:bCs w:val="false"/>
+                <w:color w:val="0F172A"/>
+                <w:sz w:val="19"/>
+                <w:szCs w:val="19"/>
+              </w:rPr>
+              <w:t xml:space="preserve">Student1661815</w:t>
             </w:r>
           </w:p>
         </w:tc>
@@ -471,67 +625,100 @@
         </w:trPr>
         <w:tc>
           <w:tcPr>
-            <w:tcW w:type="dxa" w:w="2600"/>
-            <w:tcBorders>
-              <w:top w:val="single" w:color="CBD5E1" w:sz="4"/>
-              <w:left w:val="single" w:color="CBD5E1" w:sz="4"/>
-              <w:bottom w:val="single" w:color="CBD5E1" w:sz="4"/>
-              <w:right w:val="single" w:color="CBD5E1" w:sz="4"/>
-            </w:tcBorders>
-            <w:shd w:fill="FFFFFF" w:color="auto" w:val="clear"/>
-            <w:tcMar>
-              <w:top w:type="dxa" w:w="70"/>
-              <w:left w:type="dxa" w:w="110"/>
-              <w:bottom w:type="dxa" w:w="70"/>
-              <w:right w:type="dxa" w:w="110"/>
-            </w:tcMar>
-          </w:tcPr>
-          <w:p>
-            <w:pPr>
-              <w:spacing w:after="0" w:line="264"/>
-            </w:pPr>
-            <w:r>
-              <w:rPr>
-                <w:b w:val="false"/>
-                <w:bCs w:val="false"/>
-                <w:color w:val="0F172A"/>
-                <w:sz w:val="19"/>
-                <w:szCs w:val="19"/>
-              </w:rPr>
-              <w:t xml:space="preserve">Batch / Group</w:t>
-            </w:r>
-          </w:p>
-        </w:tc>
-        <w:tc>
-          <w:tcPr>
-            <w:tcW w:type="dxa" w:w="7038"/>
-            <w:tcBorders>
-              <w:top w:val="single" w:color="CBD5E1" w:sz="4"/>
-              <w:left w:val="single" w:color="CBD5E1" w:sz="4"/>
-              <w:bottom w:val="single" w:color="CBD5E1" w:sz="4"/>
-              <w:right w:val="single" w:color="CBD5E1" w:sz="4"/>
-            </w:tcBorders>
-            <w:shd w:fill="FFFFFF" w:color="auto" w:val="clear"/>
-            <w:tcMar>
-              <w:top w:type="dxa" w:w="70"/>
-              <w:left w:type="dxa" w:w="110"/>
-              <w:bottom w:type="dxa" w:w="70"/>
-              <w:right w:type="dxa" w:w="110"/>
-            </w:tcMar>
-          </w:tcPr>
-          <w:p>
-            <w:pPr>
-              <w:spacing w:after="0" w:line="264"/>
-            </w:pPr>
-            <w:r>
-              <w:rPr>
-                <w:b w:val="false"/>
-                <w:bCs w:val="false"/>
-                <w:color w:val="0F172A"/>
-                <w:sz w:val="19"/>
-                <w:szCs w:val="19"/>
-              </w:rPr>
-              <w:t xml:space="preserve">[Batch] / [Group]</w:t>
+            <w:tcW w:type="dxa" w:w="700"/>
+            <w:tcBorders>
+              <w:top w:val="single" w:color="CBD5E1" w:sz="4"/>
+              <w:left w:val="single" w:color="CBD5E1" w:sz="4"/>
+              <w:bottom w:val="single" w:color="CBD5E1" w:sz="4"/>
+              <w:right w:val="single" w:color="CBD5E1" w:sz="4"/>
+            </w:tcBorders>
+            <w:shd w:fill="F8FAFC" w:color="auto" w:val="clear"/>
+            <w:tcMar>
+              <w:top w:type="dxa" w:w="70"/>
+              <w:left w:type="dxa" w:w="110"/>
+              <w:bottom w:type="dxa" w:w="70"/>
+              <w:right w:type="dxa" w:w="110"/>
+            </w:tcMar>
+          </w:tcPr>
+          <w:p>
+            <w:pPr>
+              <w:spacing w:after="0" w:line="264"/>
+            </w:pPr>
+            <w:r>
+              <w:rPr>
+                <w:b w:val="false"/>
+                <w:bCs w:val="false"/>
+                <w:color w:val="0F172A"/>
+                <w:sz w:val="19"/>
+                <w:szCs w:val="19"/>
+              </w:rPr>
+              <w:t xml:space="preserve">2</w:t>
+            </w:r>
+          </w:p>
+        </w:tc>
+        <w:tc>
+          <w:tcPr>
+            <w:tcW w:type="dxa" w:w="5338"/>
+            <w:tcBorders>
+              <w:top w:val="single" w:color="CBD5E1" w:sz="4"/>
+              <w:left w:val="single" w:color="CBD5E1" w:sz="4"/>
+              <w:bottom w:val="single" w:color="CBD5E1" w:sz="4"/>
+              <w:right w:val="single" w:color="CBD5E1" w:sz="4"/>
+            </w:tcBorders>
+            <w:shd w:fill="F8FAFC" w:color="auto" w:val="clear"/>
+            <w:tcMar>
+              <w:top w:type="dxa" w:w="70"/>
+              <w:left w:type="dxa" w:w="110"/>
+              <w:bottom w:type="dxa" w:w="70"/>
+              <w:right w:type="dxa" w:w="110"/>
+            </w:tcMar>
+          </w:tcPr>
+          <w:p>
+            <w:pPr>
+              <w:spacing w:after="0" w:line="264"/>
+            </w:pPr>
+            <w:r>
+              <w:rPr>
+                <w:b/>
+                <w:bCs/>
+                <w:color w:val="0F172A"/>
+                <w:sz w:val="19"/>
+                <w:szCs w:val="19"/>
+              </w:rPr>
+              <w:t xml:space="preserve">Humaiz Khan</w:t>
+            </w:r>
+          </w:p>
+        </w:tc>
+        <w:tc>
+          <w:tcPr>
+            <w:tcW w:type="dxa" w:w="3600"/>
+            <w:tcBorders>
+              <w:top w:val="single" w:color="CBD5E1" w:sz="4"/>
+              <w:left w:val="single" w:color="CBD5E1" w:sz="4"/>
+              <w:bottom w:val="single" w:color="CBD5E1" w:sz="4"/>
+              <w:right w:val="single" w:color="CBD5E1" w:sz="4"/>
+            </w:tcBorders>
+            <w:shd w:fill="F8FAFC" w:color="auto" w:val="clear"/>
+            <w:tcMar>
+              <w:top w:type="dxa" w:w="70"/>
+              <w:left w:type="dxa" w:w="110"/>
+              <w:bottom w:type="dxa" w:w="70"/>
+              <w:right w:type="dxa" w:w="110"/>
+            </w:tcMar>
+          </w:tcPr>
+          <w:p>
+            <w:pPr>
+              <w:spacing w:after="0" w:line="264"/>
+            </w:pPr>
+            <w:r>
+              <w:rPr>
+                <w:b w:val="false"/>
+                <w:bCs w:val="false"/>
+                <w:color w:val="0F172A"/>
+                <w:sz w:val="19"/>
+                <w:szCs w:val="19"/>
+              </w:rPr>
+              <w:t xml:space="preserve">Student1659420</w:t>
             </w:r>
           </w:p>
         </w:tc>
@@ -542,7 +729,111 @@
         </w:trPr>
         <w:tc>
           <w:tcPr>
-            <w:tcW w:type="dxa" w:w="2600"/>
+            <w:tcW w:type="dxa" w:w="700"/>
+            <w:tcBorders>
+              <w:top w:val="single" w:color="CBD5E1" w:sz="4"/>
+              <w:left w:val="single" w:color="CBD5E1" w:sz="4"/>
+              <w:bottom w:val="single" w:color="CBD5E1" w:sz="4"/>
+              <w:right w:val="single" w:color="CBD5E1" w:sz="4"/>
+            </w:tcBorders>
+            <w:shd w:fill="FFFFFF" w:color="auto" w:val="clear"/>
+            <w:tcMar>
+              <w:top w:type="dxa" w:w="70"/>
+              <w:left w:type="dxa" w:w="110"/>
+              <w:bottom w:type="dxa" w:w="70"/>
+              <w:right w:type="dxa" w:w="110"/>
+            </w:tcMar>
+          </w:tcPr>
+          <w:p>
+            <w:pPr>
+              <w:spacing w:after="0" w:line="264"/>
+            </w:pPr>
+            <w:r>
+              <w:rPr>
+                <w:b w:val="false"/>
+                <w:bCs w:val="false"/>
+                <w:color w:val="0F172A"/>
+                <w:sz w:val="19"/>
+                <w:szCs w:val="19"/>
+              </w:rPr>
+              <w:t xml:space="preserve">3</w:t>
+            </w:r>
+          </w:p>
+        </w:tc>
+        <w:tc>
+          <w:tcPr>
+            <w:tcW w:type="dxa" w:w="5338"/>
+            <w:tcBorders>
+              <w:top w:val="single" w:color="CBD5E1" w:sz="4"/>
+              <w:left w:val="single" w:color="CBD5E1" w:sz="4"/>
+              <w:bottom w:val="single" w:color="CBD5E1" w:sz="4"/>
+              <w:right w:val="single" w:color="CBD5E1" w:sz="4"/>
+            </w:tcBorders>
+            <w:shd w:fill="FFFFFF" w:color="auto" w:val="clear"/>
+            <w:tcMar>
+              <w:top w:type="dxa" w:w="70"/>
+              <w:left w:type="dxa" w:w="110"/>
+              <w:bottom w:type="dxa" w:w="70"/>
+              <w:right w:type="dxa" w:w="110"/>
+            </w:tcMar>
+          </w:tcPr>
+          <w:p>
+            <w:pPr>
+              <w:spacing w:after="0" w:line="264"/>
+            </w:pPr>
+            <w:r>
+              <w:rPr>
+                <w:b/>
+                <w:bCs/>
+                <w:color w:val="0F172A"/>
+                <w:sz w:val="19"/>
+                <w:szCs w:val="19"/>
+              </w:rPr>
+              <w:t xml:space="preserve">Muhammad Ehtisham Shakeel</w:t>
+            </w:r>
+          </w:p>
+        </w:tc>
+        <w:tc>
+          <w:tcPr>
+            <w:tcW w:type="dxa" w:w="3600"/>
+            <w:tcBorders>
+              <w:top w:val="single" w:color="CBD5E1" w:sz="4"/>
+              <w:left w:val="single" w:color="CBD5E1" w:sz="4"/>
+              <w:bottom w:val="single" w:color="CBD5E1" w:sz="4"/>
+              <w:right w:val="single" w:color="CBD5E1" w:sz="4"/>
+            </w:tcBorders>
+            <w:shd w:fill="FFFFFF" w:color="auto" w:val="clear"/>
+            <w:tcMar>
+              <w:top w:type="dxa" w:w="70"/>
+              <w:left w:type="dxa" w:w="110"/>
+              <w:bottom w:type="dxa" w:w="70"/>
+              <w:right w:type="dxa" w:w="110"/>
+            </w:tcMar>
+          </w:tcPr>
+          <w:p>
+            <w:pPr>
+              <w:spacing w:after="0" w:line="264"/>
+            </w:pPr>
+            <w:r>
+              <w:rPr>
+                <w:b w:val="false"/>
+                <w:bCs w:val="false"/>
+                <w:color w:val="0F172A"/>
+                <w:sz w:val="19"/>
+                <w:szCs w:val="19"/>
+              </w:rPr>
+              <w:t xml:space="preserve">Student1657963</w:t>
+            </w:r>
+          </w:p>
+        </w:tc>
+      </w:tr>
+      <w:tr>
+        <w:trPr>
+          <w:cantSplit/>
+        </w:trPr>
+        <w:tc>
+          <w:tcPr>
+            <w:tcW w:type="dxa" w:w="700"/>
             <w:tcBorders>
               <w:top w:val="single" w:color="CBD5E1" w:sz="4"/>
               <w:left w:val="single" w:color="CBD5E1" w:sz="4"/>
@@ -569,13 +860,13 @@
                 <w:sz w:val="19"/>
                 <w:szCs w:val="19"/>
               </w:rPr>
-              <w:t xml:space="preserve">Submission date</w:t>
-            </w:r>
-          </w:p>
-        </w:tc>
-        <w:tc>
-          <w:tcPr>
-            <w:tcW w:type="dxa" w:w="7038"/>
+              <w:t xml:space="preserve">4</w:t>
+            </w:r>
+          </w:p>
+        </w:tc>
+        <w:tc>
+          <w:tcPr>
+            <w:tcW w:type="dxa" w:w="5338"/>
             <w:tcBorders>
               <w:top w:val="single" w:color="CBD5E1" w:sz="4"/>
               <w:left w:val="single" w:color="CBD5E1" w:sz="4"/>
@@ -596,13 +887,150 @@
             </w:pPr>
             <w:r>
               <w:rPr>
-                <w:b w:val="false"/>
-                <w:bCs w:val="false"/>
-                <w:color w:val="0F172A"/>
-                <w:sz w:val="19"/>
-                <w:szCs w:val="19"/>
-              </w:rPr>
-              <w:t xml:space="preserve">[DD/MMM/YYYY]</w:t>
+                <w:b/>
+                <w:bCs/>
+                <w:color w:val="0F172A"/>
+                <w:sz w:val="19"/>
+                <w:szCs w:val="19"/>
+              </w:rPr>
+              <w:t xml:space="preserve">Muhammad Waleed</w:t>
+            </w:r>
+          </w:p>
+        </w:tc>
+        <w:tc>
+          <w:tcPr>
+            <w:tcW w:type="dxa" w:w="3600"/>
+            <w:tcBorders>
+              <w:top w:val="single" w:color="CBD5E1" w:sz="4"/>
+              <w:left w:val="single" w:color="CBD5E1" w:sz="4"/>
+              <w:bottom w:val="single" w:color="CBD5E1" w:sz="4"/>
+              <w:right w:val="single" w:color="CBD5E1" w:sz="4"/>
+            </w:tcBorders>
+            <w:shd w:fill="F8FAFC" w:color="auto" w:val="clear"/>
+            <w:tcMar>
+              <w:top w:type="dxa" w:w="70"/>
+              <w:left w:type="dxa" w:w="110"/>
+              <w:bottom w:type="dxa" w:w="70"/>
+              <w:right w:type="dxa" w:w="110"/>
+            </w:tcMar>
+          </w:tcPr>
+          <w:p>
+            <w:pPr>
+              <w:spacing w:after="0" w:line="264"/>
+            </w:pPr>
+            <w:r>
+              <w:rPr>
+                <w:b w:val="false"/>
+                <w:bCs w:val="false"/>
+                <w:color w:val="0F172A"/>
+                <w:sz w:val="19"/>
+                <w:szCs w:val="19"/>
+              </w:rPr>
+              <w:t xml:space="preserve">Student1659932</w:t>
+            </w:r>
+          </w:p>
+        </w:tc>
+      </w:tr>
+      <w:tr>
+        <w:trPr>
+          <w:cantSplit/>
+        </w:trPr>
+        <w:tc>
+          <w:tcPr>
+            <w:tcW w:type="dxa" w:w="700"/>
+            <w:tcBorders>
+              <w:top w:val="single" w:color="CBD5E1" w:sz="4"/>
+              <w:left w:val="single" w:color="CBD5E1" w:sz="4"/>
+              <w:bottom w:val="single" w:color="CBD5E1" w:sz="4"/>
+              <w:right w:val="single" w:color="CBD5E1" w:sz="4"/>
+            </w:tcBorders>
+            <w:shd w:fill="FFFFFF" w:color="auto" w:val="clear"/>
+            <w:tcMar>
+              <w:top w:type="dxa" w:w="70"/>
+              <w:left w:type="dxa" w:w="110"/>
+              <w:bottom w:type="dxa" w:w="70"/>
+              <w:right w:type="dxa" w:w="110"/>
+            </w:tcMar>
+          </w:tcPr>
+          <w:p>
+            <w:pPr>
+              <w:spacing w:after="0" w:line="264"/>
+            </w:pPr>
+            <w:r>
+              <w:rPr>
+                <w:b w:val="false"/>
+                <w:bCs w:val="false"/>
+                <w:color w:val="0F172A"/>
+                <w:sz w:val="19"/>
+                <w:szCs w:val="19"/>
+              </w:rPr>
+              <w:t xml:space="preserve">5</w:t>
+            </w:r>
+          </w:p>
+        </w:tc>
+        <w:tc>
+          <w:tcPr>
+            <w:tcW w:type="dxa" w:w="5338"/>
+            <w:tcBorders>
+              <w:top w:val="single" w:color="CBD5E1" w:sz="4"/>
+              <w:left w:val="single" w:color="CBD5E1" w:sz="4"/>
+              <w:bottom w:val="single" w:color="CBD5E1" w:sz="4"/>
+              <w:right w:val="single" w:color="CBD5E1" w:sz="4"/>
+            </w:tcBorders>
+            <w:shd w:fill="FFFFFF" w:color="auto" w:val="clear"/>
+            <w:tcMar>
+              <w:top w:type="dxa" w:w="70"/>
+              <w:left w:type="dxa" w:w="110"/>
+              <w:bottom w:type="dxa" w:w="70"/>
+              <w:right w:type="dxa" w:w="110"/>
+            </w:tcMar>
+          </w:tcPr>
+          <w:p>
+            <w:pPr>
+              <w:spacing w:after="0" w:line="264"/>
+            </w:pPr>
+            <w:r>
+              <w:rPr>
+                <w:b/>
+                <w:bCs/>
+                <w:color w:val="0F172A"/>
+                <w:sz w:val="19"/>
+                <w:szCs w:val="19"/>
+              </w:rPr>
+              <w:t xml:space="preserve">Ali Turab</w:t>
+            </w:r>
+          </w:p>
+        </w:tc>
+        <w:tc>
+          <w:tcPr>
+            <w:tcW w:type="dxa" w:w="3600"/>
+            <w:tcBorders>
+              <w:top w:val="single" w:color="CBD5E1" w:sz="4"/>
+              <w:left w:val="single" w:color="CBD5E1" w:sz="4"/>
+              <w:bottom w:val="single" w:color="CBD5E1" w:sz="4"/>
+              <w:right w:val="single" w:color="CBD5E1" w:sz="4"/>
+            </w:tcBorders>
+            <w:shd w:fill="FFFFFF" w:color="auto" w:val="clear"/>
+            <w:tcMar>
+              <w:top w:type="dxa" w:w="70"/>
+              <w:left w:type="dxa" w:w="110"/>
+              <w:bottom w:type="dxa" w:w="70"/>
+              <w:right w:type="dxa" w:w="110"/>
+            </w:tcMar>
+          </w:tcPr>
+          <w:p>
+            <w:pPr>
+              <w:spacing w:after="0" w:line="264"/>
+            </w:pPr>
+            <w:r>
+              <w:rPr>
+                <w:b w:val="false"/>
+                <w:bCs w:val="false"/>
+                <w:color w:val="0F172A"/>
+                <w:sz w:val="19"/>
+                <w:szCs w:val="19"/>
+              </w:rPr>
+              <w:t xml:space="preserve">Student1667727</w:t>
             </w:r>
           </w:p>
         </w:tc>
@@ -1966,7 +2394,7 @@
                 <w:sz w:val="20"/>
                 <w:szCs w:val="20"/>
               </w:rPr>
-              <w:t xml:space="preserve">The menu item of the page you are on is highlighted as a clear-glass button.</w:t>
+              <w:t xml:space="preserve">The menu item of the page you are on is highlighted in the top bar.</w:t>
             </w:r>
           </w:p>
           <w:p>
@@ -1978,7 +2406,7 @@
                 <w:sz w:val="20"/>
                 <w:szCs w:val="20"/>
               </w:rPr>
-              <w:t xml:space="preserve">Cards you can click light up and turn clear when you point at them.</w:t>
+              <w:t xml:space="preserve">Cards you can click light up and lift slightly when you point at them.</w:t>
             </w:r>
           </w:p>
         </w:tc>
@@ -1986,19 +2414,10 @@
     </w:tbl>
     <w:p>
       <w:pPr>
-        <w:pStyle w:val="Heading1"/>
-        <w:pageBreakBefore/>
-      </w:pPr>
-      <w:r>
-        <w:t xml:space="preserve">3. Public Pages</w:t>
-      </w:r>
-    </w:p>
-    <w:p>
-      <w:pPr>
         <w:pStyle w:val="Heading2"/>
       </w:pPr>
       <w:r>
-        <w:t xml:space="preserve">3.1 Home page</w:t>
+        <w:t xml:space="preserve">2.4 Light and dark mode</w:t>
       </w:r>
     </w:p>
     <w:p>
@@ -2006,7 +2425,67 @@
         <w:spacing w:after="120" w:line="288"/>
       </w:pPr>
       <w:r>
-        <w:t xml:space="preserve">The home page introduces the three services, the cities served, the bulk discount bands and how the process works. From here you can compare plans, track an order or register.</w:t>
+        <w:t xml:space="preserve">Click the round </w:t>
+      </w:r>
+      <w:r>
+        <w:rPr>
+          <w:b/>
+          <w:bCs/>
+        </w:rPr>
+        <w:t xml:space="preserve">sun / moon</w:t>
+      </w:r>
+      <w:r>
+        <w:t xml:space="preserve"> button in the top bar (on a phone it is inside the menu, labelled </w:t>
+      </w:r>
+      <w:r>
+        <w:rPr>
+          <w:b/>
+          <w:bCs/>
+        </w:rPr>
+        <w:t xml:space="preserve">Theme</w:t>
+      </w:r>
+      <w:r>
+        <w:t xml:space="preserve">). The whole site switches between a light and a dark look straight away, and the choice is remembered the next time you open the site on that computer.</w:t>
+      </w:r>
+    </w:p>
+    <w:p>
+      <w:pPr>
+        <w:pStyle w:val="ListParagraph"/>
+        <w:numPr>
+          <w:ilvl w:val="0"/>
+          <w:numId w:val="3"/>
+        </w:numPr>
+        <w:spacing w:after="60" w:line="276"/>
+      </w:pPr>
+      <w:r>
+        <w:rPr>
+          <w:b/>
+          <w:bCs/>
+        </w:rPr>
+        <w:t xml:space="preserve">Light mode</w:t>
+      </w:r>
+      <w:r>
+        <w:t xml:space="preserve"> - white cards on a pale blue background; best for bright rooms, projectors and printing.</w:t>
+      </w:r>
+    </w:p>
+    <w:p>
+      <w:pPr>
+        <w:pStyle w:val="ListParagraph"/>
+        <w:numPr>
+          <w:ilvl w:val="0"/>
+          <w:numId w:val="3"/>
+        </w:numPr>
+        <w:spacing w:after="60" w:line="276"/>
+      </w:pPr>
+      <w:r>
+        <w:rPr>
+          <w:b/>
+          <w:bCs/>
+        </w:rPr>
+        <w:t xml:space="preserve">Dark mode</w:t>
+      </w:r>
+      <w:r>
+        <w:t xml:space="preserve"> - dark navy cards; easier on the eyes in a dim room.</w:t>
       </w:r>
     </w:p>
     <w:p>
@@ -2018,9 +2497,9 @@
       <w:r>
         <w:drawing>
           <wp:inline distT="0" distB="0" distL="0" distR="0">
-            <wp:extent cx="5715000" cy="3571875"/>
+            <wp:extent cx="6096000" cy="2038350"/>
             <wp:effectExtent t="0" r="0" b="0" l="0"/>
-            <wp:docPr id="4" name="ui-home.jpg" descr="ui home jpg" title="ui-home.jpg"/>
+            <wp:docPr id="4" name="ui-themes.jpg" descr="ui themes jpg" title="ui-themes.jpg"/>
             <wp:cNvGraphicFramePr>
               <a:graphicFrameLocks xmlns:a="http://schemas.openxmlformats.org/drawingml/2006/main" noChangeAspect="1"/>
             </wp:cNvGraphicFramePr>
@@ -2043,7 +2522,7 @@
                   <pic:spPr bwMode="auto">
                     <a:xfrm>
                       <a:off x="0" y="0"/>
-                      <a:ext cx="5715000" cy="3571875"/>
+                      <a:ext cx="6096000" cy="2038350"/>
                     </a:xfrm>
                     <a:prstGeom prst="rect">
                       <a:avLst/>
@@ -2069,7 +2548,16 @@
           <w:sz w:val="18"/>
           <w:szCs w:val="18"/>
         </w:rPr>
-        <w:t xml:space="preserve">Figure 3 - Home page</w:t>
+        <w:t xml:space="preserve">Figure 3 - The same page in light mode (left) and dark mode (right)</w:t>
+      </w:r>
+    </w:p>
+    <w:p>
+      <w:pPr>
+        <w:pStyle w:val="Heading1"/>
+        <w:pageBreakBefore/>
+      </w:pPr>
+      <w:r>
+        <w:t xml:space="preserve">3. Public Pages</w:t>
       </w:r>
     </w:p>
     <w:p>
@@ -2077,7 +2565,7 @@
         <w:pStyle w:val="Heading2"/>
       </w:pPr>
       <w:r>
-        <w:t xml:space="preserve">3.2 Plans and prices</w:t>
+        <w:t xml:space="preserve">3.1 Home page</w:t>
       </w:r>
     </w:p>
     <w:p>
@@ -2085,17 +2573,7 @@
         <w:spacing w:after="120" w:line="288"/>
       </w:pPr>
       <w:r>
-        <w:t xml:space="preserve">Click </w:t>
-      </w:r>
-      <w:r>
-        <w:rPr>
-          <w:b/>
-          <w:bCs/>
-        </w:rPr>
-        <w:t xml:space="preserve">Plans</w:t>
-      </w:r>
-      <w:r>
-        <w:t xml:space="preserve"> in the menu. Plans are grouped by service; use the Dial-Up / Broadband / Landline tabs to jump to a group. Each card shows the price, the period it covers, what is included and the refundable deposit.</w:t>
+        <w:t xml:space="preserve">The home page introduces the three services, the cities served, the bulk discount bands and how the process works. From here you can compare plans, track an order or register.</w:t>
       </w:r>
     </w:p>
     <w:p>
@@ -2109,7 +2587,7 @@
           <wp:inline distT="0" distB="0" distL="0" distR="0">
             <wp:extent cx="5715000" cy="3571875"/>
             <wp:effectExtent t="0" r="0" b="0" l="0"/>
-            <wp:docPr id="5" name="ui-plans.jpg" descr="ui plans jpg" title="ui-plans.jpg"/>
+            <wp:docPr id="5" name="ui-home.jpg" descr="ui home jpg" title="ui-home.jpg"/>
             <wp:cNvGraphicFramePr>
               <a:graphicFrameLocks xmlns:a="http://schemas.openxmlformats.org/drawingml/2006/main" noChangeAspect="1"/>
             </wp:cNvGraphicFramePr>
@@ -2158,7 +2636,7 @@
           <w:sz w:val="18"/>
           <w:szCs w:val="18"/>
         </w:rPr>
-        <w:t xml:space="preserve">Figure 4 - Plans and prices</w:t>
+        <w:t xml:space="preserve">Figure 4 - Home page</w:t>
       </w:r>
     </w:p>
     <w:p>
@@ -2166,17 +2644,12 @@
         <w:pStyle w:val="Heading2"/>
       </w:pPr>
       <w:r>
-        <w:t xml:space="preserve">3.3 Tracking an order or connection</w:t>
-      </w:r>
-    </w:p>
-    <w:p>
-      <w:pPr>
-        <w:pStyle w:val="ListParagraph"/>
-        <w:numPr>
-          <w:ilvl w:val="0"/>
-          <w:numId w:val="6"/>
-        </w:numPr>
-        <w:spacing w:after="60" w:line="276"/>
+        <w:t xml:space="preserve">3.2 Plans and prices</w:t>
+      </w:r>
+    </w:p>
+    <w:p>
+      <w:pPr>
+        <w:spacing w:after="120" w:line="288"/>
       </w:pPr>
       <w:r>
         <w:t xml:space="preserve">Click </w:t>
@@ -2186,56 +2659,10 @@
           <w:b/>
           <w:bCs/>
         </w:rPr>
-        <w:t xml:space="preserve">Track</w:t>
-      </w:r>
-      <w:r>
-        <w:t xml:space="preserve"> in the menu.</w:t>
-      </w:r>
-    </w:p>
-    <w:p>
-      <w:pPr>
-        <w:pStyle w:val="ListParagraph"/>
-        <w:numPr>
-          <w:ilvl w:val="0"/>
-          <w:numId w:val="6"/>
-        </w:numPr>
-        <w:spacing w:after="60" w:line="276"/>
-      </w:pPr>
-      <w:r>
-        <w:t xml:space="preserve">Enter your 11-character order number (for example D0000000001) or your 16-character account ID.</w:t>
-      </w:r>
-    </w:p>
-    <w:p>
-      <w:pPr>
-        <w:pStyle w:val="ListParagraph"/>
-        <w:numPr>
-          <w:ilvl w:val="0"/>
-          <w:numId w:val="6"/>
-        </w:numPr>
-        <w:spacing w:after="60" w:line="276"/>
-      </w:pPr>
-      <w:r>
-        <w:t xml:space="preserve">Click </w:t>
-      </w:r>
-      <w:r>
-        <w:rPr>
-          <w:b/>
-          <w:bCs/>
-        </w:rPr>
-        <w:t xml:space="preserve">Search</w:t>
-      </w:r>
-      <w:r>
-        <w:t xml:space="preserve"> to see the current stage of the order or connection (on the home page the button is </w:t>
-      </w:r>
-      <w:r>
-        <w:rPr>
-          <w:b/>
-          <w:bCs/>
-        </w:rPr>
-        <w:t xml:space="preserve">Check status</w:t>
-      </w:r>
-      <w:r>
-        <w:t xml:space="preserve">).</w:t>
+        <w:t xml:space="preserve">Plans</w:t>
+      </w:r>
+      <w:r>
+        <w:t xml:space="preserve"> in the menu. Plans are grouped by service; use the Dial-Up / Broadband / Landline tabs to jump to a group. Each card shows the price, the period it covers, what is included and the refundable deposit.</w:t>
       </w:r>
     </w:p>
     <w:p>
@@ -2249,7 +2676,7 @@
           <wp:inline distT="0" distB="0" distL="0" distR="0">
             <wp:extent cx="5715000" cy="3571875"/>
             <wp:effectExtent t="0" r="0" b="0" l="0"/>
-            <wp:docPr id="6" name="ui-track.jpg" descr="ui track jpg" title="ui-track.jpg"/>
+            <wp:docPr id="6" name="ui-plans.jpg" descr="ui plans jpg" title="ui-plans.jpg"/>
             <wp:cNvGraphicFramePr>
               <a:graphicFrameLocks xmlns:a="http://schemas.openxmlformats.org/drawingml/2006/main" noChangeAspect="1"/>
             </wp:cNvGraphicFramePr>
@@ -2298,16 +2725,7 @@
           <w:sz w:val="18"/>
           <w:szCs w:val="18"/>
         </w:rPr>
-        <w:t xml:space="preserve">Figure 5 - Tracking an order</w:t>
-      </w:r>
-    </w:p>
-    <w:p>
-      <w:pPr>
-        <w:pStyle w:val="Heading1"/>
-        <w:pageBreakBefore/>
-      </w:pPr>
-      <w:r>
-        <w:t xml:space="preserve">4. Customer Guide</w:t>
+        <w:t xml:space="preserve">Figure 5 - Plans and prices</w:t>
       </w:r>
     </w:p>
     <w:p>
@@ -2315,15 +2733,76 @@
         <w:pStyle w:val="Heading2"/>
       </w:pPr>
       <w:r>
-        <w:t xml:space="preserve">4.1 Dashboard</w:t>
-      </w:r>
-    </w:p>
-    <w:p>
-      <w:pPr>
-        <w:spacing w:after="120" w:line="288"/>
-      </w:pPr>
-      <w:r>
-        <w:t xml:space="preserve">After signing in you see your dashboard: open orders, active connections, the balance still due and quick links to every customer page.</w:t>
+        <w:t xml:space="preserve">3.3 Tracking an order or connection</w:t>
+      </w:r>
+    </w:p>
+    <w:p>
+      <w:pPr>
+        <w:pStyle w:val="ListParagraph"/>
+        <w:numPr>
+          <w:ilvl w:val="0"/>
+          <w:numId w:val="6"/>
+        </w:numPr>
+        <w:spacing w:after="60" w:line="276"/>
+      </w:pPr>
+      <w:r>
+        <w:t xml:space="preserve">Click </w:t>
+      </w:r>
+      <w:r>
+        <w:rPr>
+          <w:b/>
+          <w:bCs/>
+        </w:rPr>
+        <w:t xml:space="preserve">Track</w:t>
+      </w:r>
+      <w:r>
+        <w:t xml:space="preserve"> in the menu.</w:t>
+      </w:r>
+    </w:p>
+    <w:p>
+      <w:pPr>
+        <w:pStyle w:val="ListParagraph"/>
+        <w:numPr>
+          <w:ilvl w:val="0"/>
+          <w:numId w:val="6"/>
+        </w:numPr>
+        <w:spacing w:after="60" w:line="276"/>
+      </w:pPr>
+      <w:r>
+        <w:t xml:space="preserve">Enter your 11-character order number (for example D0000000001) or your 16-character account ID.</w:t>
+      </w:r>
+    </w:p>
+    <w:p>
+      <w:pPr>
+        <w:pStyle w:val="ListParagraph"/>
+        <w:numPr>
+          <w:ilvl w:val="0"/>
+          <w:numId w:val="6"/>
+        </w:numPr>
+        <w:spacing w:after="60" w:line="276"/>
+      </w:pPr>
+      <w:r>
+        <w:t xml:space="preserve">Click </w:t>
+      </w:r>
+      <w:r>
+        <w:rPr>
+          <w:b/>
+          <w:bCs/>
+        </w:rPr>
+        <w:t xml:space="preserve">Search</w:t>
+      </w:r>
+      <w:r>
+        <w:t xml:space="preserve"> to see the current stage of the order or connection (on the home page the button is </w:t>
+      </w:r>
+      <w:r>
+        <w:rPr>
+          <w:b/>
+          <w:bCs/>
+        </w:rPr>
+        <w:t xml:space="preserve">Check status</w:t>
+      </w:r>
+      <w:r>
+        <w:t xml:space="preserve">).</w:t>
       </w:r>
     </w:p>
     <w:p>
@@ -2337,7 +2816,7 @@
           <wp:inline distT="0" distB="0" distL="0" distR="0">
             <wp:extent cx="5715000" cy="3571875"/>
             <wp:effectExtent t="0" r="0" b="0" l="0"/>
-            <wp:docPr id="7" name="ui-customer-dashboard.jpg" descr="ui customer dashboard jpg" title="ui-customer-dashboard.jpg"/>
+            <wp:docPr id="7" name="ui-track.jpg" descr="ui track jpg" title="ui-track.jpg"/>
             <wp:cNvGraphicFramePr>
               <a:graphicFrameLocks xmlns:a="http://schemas.openxmlformats.org/drawingml/2006/main" noChangeAspect="1"/>
             </wp:cNvGraphicFramePr>
@@ -2386,7 +2865,16 @@
           <w:sz w:val="18"/>
           <w:szCs w:val="18"/>
         </w:rPr>
-        <w:t xml:space="preserve">Figure 6 - Customer dashboard</w:t>
+        <w:t xml:space="preserve">Figure 6 - Tracking an order</w:t>
+      </w:r>
+    </w:p>
+    <w:p>
+      <w:pPr>
+        <w:pStyle w:val="Heading1"/>
+        <w:pageBreakBefore/>
+      </w:pPr>
+      <w:r>
+        <w:t xml:space="preserve">4. Customer Guide</w:t>
       </w:r>
     </w:p>
     <w:p>
@@ -2394,152 +2882,15 @@
         <w:pStyle w:val="Heading2"/>
       </w:pPr>
       <w:r>
-        <w:t xml:space="preserve">4.2 Placing an order</w:t>
-      </w:r>
-    </w:p>
-    <w:p>
-      <w:pPr>
-        <w:pStyle w:val="ListParagraph"/>
-        <w:numPr>
-          <w:ilvl w:val="0"/>
-          <w:numId w:val="7"/>
-        </w:numPr>
-        <w:spacing w:after="60" w:line="276"/>
-      </w:pPr>
-      <w:r>
-        <w:t xml:space="preserve">Open </w:t>
-      </w:r>
-      <w:r>
-        <w:rPr>
-          <w:b/>
-          <w:bCs/>
-        </w:rPr>
-        <w:t xml:space="preserve">Place order</w:t>
-      </w:r>
-      <w:r>
-        <w:t xml:space="preserve"> from the dashboard or the menu.</w:t>
-      </w:r>
-    </w:p>
-    <w:p>
-      <w:pPr>
-        <w:pStyle w:val="ListParagraph"/>
-        <w:numPr>
-          <w:ilvl w:val="0"/>
-          <w:numId w:val="7"/>
-        </w:numPr>
-        <w:spacing w:after="60" w:line="276"/>
-      </w:pPr>
-      <w:r>
-        <w:t xml:space="preserve">Choose the </w:t>
-      </w:r>
-      <w:r>
-        <w:rPr>
-          <w:b/>
-          <w:bCs/>
-        </w:rPr>
-        <w:t xml:space="preserve">connection type</w:t>
-      </w:r>
-      <w:r>
-        <w:t xml:space="preserve"> - Dial-Up, Broadband or Landline - and then a </w:t>
-      </w:r>
-      <w:r>
-        <w:rPr>
-          <w:b/>
-          <w:bCs/>
-        </w:rPr>
-        <w:t xml:space="preserve">plan</w:t>
-      </w:r>
-      <w:r>
-        <w:t xml:space="preserve">.</w:t>
-      </w:r>
-    </w:p>
-    <w:p>
-      <w:pPr>
-        <w:pStyle w:val="ListParagraph"/>
-        <w:numPr>
-          <w:ilvl w:val="0"/>
-          <w:numId w:val="7"/>
-        </w:numPr>
-        <w:spacing w:after="60" w:line="276"/>
-      </w:pPr>
-      <w:r>
-        <w:t xml:space="preserve">Dial-Up needs a Nexus landline. If you do not have one, also choose a </w:t>
-      </w:r>
-      <w:r>
-        <w:rPr>
-          <w:b/>
-          <w:bCs/>
-        </w:rPr>
-        <w:t xml:space="preserve">landline plan</w:t>
-      </w:r>
-      <w:r>
-        <w:t xml:space="preserve">: both are ordered together.</w:t>
-      </w:r>
-    </w:p>
-    <w:p>
-      <w:pPr>
-        <w:pStyle w:val="ListParagraph"/>
-        <w:numPr>
-          <w:ilvl w:val="0"/>
-          <w:numId w:val="7"/>
-        </w:numPr>
-        <w:spacing w:after="60" w:line="276"/>
-      </w:pPr>
-      <w:r>
-        <w:t xml:space="preserve">Enter the </w:t>
-      </w:r>
-      <w:r>
-        <w:rPr>
-          <w:b/>
-          <w:bCs/>
-        </w:rPr>
-        <w:t xml:space="preserve">installation address</w:t>
-      </w:r>
-      <w:r>
-        <w:t xml:space="preserve"> and </w:t>
-      </w:r>
-      <w:r>
-        <w:rPr>
-          <w:b/>
-          <w:bCs/>
-        </w:rPr>
-        <w:t xml:space="preserve">city</w:t>
-      </w:r>
-      <w:r>
-        <w:t xml:space="preserve">, and the </w:t>
-      </w:r>
-      <w:r>
-        <w:rPr>
-          <w:b/>
-          <w:bCs/>
-        </w:rPr>
-        <w:t xml:space="preserve">number of connections</w:t>
-      </w:r>
-      <w:r>
-        <w:t xml:space="preserve"> (10 or more gives a bulk discount).</w:t>
-      </w:r>
-    </w:p>
-    <w:p>
-      <w:pPr>
-        <w:pStyle w:val="ListParagraph"/>
-        <w:numPr>
-          <w:ilvl w:val="0"/>
-          <w:numId w:val="7"/>
-        </w:numPr>
-        <w:spacing w:after="60" w:line="276"/>
-      </w:pPr>
-      <w:r>
-        <w:t xml:space="preserve">Click </w:t>
-      </w:r>
-      <w:r>
-        <w:rPr>
-          <w:b/>
-          <w:bCs/>
-        </w:rPr>
-        <w:t xml:space="preserve">Place order</w:t>
-      </w:r>
-      <w:r>
-        <w:t xml:space="preserve">. Note the order number shown - you can track it at any time.</w:t>
+        <w:t xml:space="preserve">4.1 Dashboard</w:t>
+      </w:r>
+    </w:p>
+    <w:p>
+      <w:pPr>
+        <w:spacing w:after="120" w:line="288"/>
+      </w:pPr>
+      <w:r>
+        <w:t xml:space="preserve">After signing in you see your dashboard: open orders, active connections, the balance still due and quick links to every customer page.</w:t>
       </w:r>
     </w:p>
     <w:p>
@@ -2553,7 +2904,7 @@
           <wp:inline distT="0" distB="0" distL="0" distR="0">
             <wp:extent cx="5715000" cy="3571875"/>
             <wp:effectExtent t="0" r="0" b="0" l="0"/>
-            <wp:docPr id="8" name="ug-customer-order.jpg" descr="ug customer order jpg" title="ug-customer-order.jpg"/>
+            <wp:docPr id="8" name="ui-customer-dashboard.jpg" descr="ui customer dashboard jpg" title="ui-customer-dashboard.jpg"/>
             <wp:cNvGraphicFramePr>
               <a:graphicFrameLocks xmlns:a="http://schemas.openxmlformats.org/drawingml/2006/main" noChangeAspect="1"/>
             </wp:cNvGraphicFramePr>
@@ -2602,7 +2953,7 @@
           <w:sz w:val="18"/>
           <w:szCs w:val="18"/>
         </w:rPr>
-        <w:t xml:space="preserve">Figure 7 - Placing an order</w:t>
+        <w:t xml:space="preserve">Figure 7 - Customer dashboard</w:t>
       </w:r>
     </w:p>
     <w:p>
@@ -2610,32 +2961,152 @@
         <w:pStyle w:val="Heading2"/>
       </w:pPr>
       <w:r>
-        <w:t xml:space="preserve">4.3 My orders</w:t>
-      </w:r>
-    </w:p>
-    <w:p>
-      <w:pPr>
-        <w:spacing w:after="120" w:line="288"/>
-      </w:pPr>
+        <w:t xml:space="preserve">4.2 Placing an order</w:t>
+      </w:r>
+    </w:p>
+    <w:p>
+      <w:pPr>
+        <w:pStyle w:val="ListParagraph"/>
+        <w:numPr>
+          <w:ilvl w:val="0"/>
+          <w:numId w:val="7"/>
+        </w:numPr>
+        <w:spacing w:after="60" w:line="276"/>
+      </w:pPr>
+      <w:r>
+        <w:t xml:space="preserve">Open </w:t>
+      </w:r>
       <w:r>
         <w:rPr>
           <w:b/>
           <w:bCs/>
         </w:rPr>
-        <w:t xml:space="preserve">My orders</w:t>
-      </w:r>
-      <w:r>
-        <w:t xml:space="preserve"> lists every order with its status. Open an order to see its details. An order that has not yet been connected can be cancelled with </w:t>
+        <w:t xml:space="preserve">Place order</w:t>
+      </w:r>
+      <w:r>
+        <w:t xml:space="preserve"> from the dashboard or the menu.</w:t>
+      </w:r>
+    </w:p>
+    <w:p>
+      <w:pPr>
+        <w:pStyle w:val="ListParagraph"/>
+        <w:numPr>
+          <w:ilvl w:val="0"/>
+          <w:numId w:val="7"/>
+        </w:numPr>
+        <w:spacing w:after="60" w:line="276"/>
+      </w:pPr>
+      <w:r>
+        <w:t xml:space="preserve">Choose the </w:t>
       </w:r>
       <w:r>
         <w:rPr>
           <w:b/>
           <w:bCs/>
         </w:rPr>
-        <w:t xml:space="preserve">Cancel order</w:t>
+        <w:t xml:space="preserve">connection type</w:t>
+      </w:r>
+      <w:r>
+        <w:t xml:space="preserve"> - Dial-Up, Broadband or Landline - and then a </w:t>
+      </w:r>
+      <w:r>
+        <w:rPr>
+          <w:b/>
+          <w:bCs/>
+        </w:rPr>
+        <w:t xml:space="preserve">plan</w:t>
       </w:r>
       <w:r>
         <w:t xml:space="preserve">.</w:t>
+      </w:r>
+    </w:p>
+    <w:p>
+      <w:pPr>
+        <w:pStyle w:val="ListParagraph"/>
+        <w:numPr>
+          <w:ilvl w:val="0"/>
+          <w:numId w:val="7"/>
+        </w:numPr>
+        <w:spacing w:after="60" w:line="276"/>
+      </w:pPr>
+      <w:r>
+        <w:t xml:space="preserve">Dial-Up needs a Nexus landline. If you do not have one, also choose a </w:t>
+      </w:r>
+      <w:r>
+        <w:rPr>
+          <w:b/>
+          <w:bCs/>
+        </w:rPr>
+        <w:t xml:space="preserve">landline plan</w:t>
+      </w:r>
+      <w:r>
+        <w:t xml:space="preserve">: both are ordered together.</w:t>
+      </w:r>
+    </w:p>
+    <w:p>
+      <w:pPr>
+        <w:pStyle w:val="ListParagraph"/>
+        <w:numPr>
+          <w:ilvl w:val="0"/>
+          <w:numId w:val="7"/>
+        </w:numPr>
+        <w:spacing w:after="60" w:line="276"/>
+      </w:pPr>
+      <w:r>
+        <w:t xml:space="preserve">Enter the </w:t>
+      </w:r>
+      <w:r>
+        <w:rPr>
+          <w:b/>
+          <w:bCs/>
+        </w:rPr>
+        <w:t xml:space="preserve">installation address</w:t>
+      </w:r>
+      <w:r>
+        <w:t xml:space="preserve"> and </w:t>
+      </w:r>
+      <w:r>
+        <w:rPr>
+          <w:b/>
+          <w:bCs/>
+        </w:rPr>
+        <w:t xml:space="preserve">city</w:t>
+      </w:r>
+      <w:r>
+        <w:t xml:space="preserve">, and the </w:t>
+      </w:r>
+      <w:r>
+        <w:rPr>
+          <w:b/>
+          <w:bCs/>
+        </w:rPr>
+        <w:t xml:space="preserve">number of connections</w:t>
+      </w:r>
+      <w:r>
+        <w:t xml:space="preserve"> (10 or more gives a bulk discount).</w:t>
+      </w:r>
+    </w:p>
+    <w:p>
+      <w:pPr>
+        <w:pStyle w:val="ListParagraph"/>
+        <w:numPr>
+          <w:ilvl w:val="0"/>
+          <w:numId w:val="7"/>
+        </w:numPr>
+        <w:spacing w:after="60" w:line="276"/>
+      </w:pPr>
+      <w:r>
+        <w:t xml:space="preserve">Click </w:t>
+      </w:r>
+      <w:r>
+        <w:rPr>
+          <w:b/>
+          <w:bCs/>
+        </w:rPr>
+        <w:t xml:space="preserve">Place order</w:t>
+      </w:r>
+      <w:r>
+        <w:t xml:space="preserve">. Note the order number shown - you can track it at any time.</w:t>
       </w:r>
     </w:p>
     <w:p>
@@ -2649,7 +3120,7 @@
           <wp:inline distT="0" distB="0" distL="0" distR="0">
             <wp:extent cx="5715000" cy="3571875"/>
             <wp:effectExtent t="0" r="0" b="0" l="0"/>
-            <wp:docPr id="9" name="ug-customer-orders.jpg" descr="ug customer orders jpg" title="ug-customer-orders.jpg"/>
+            <wp:docPr id="9" name="ug-customer-order.jpg" descr="ug customer order jpg" title="ug-customer-order.jpg"/>
             <wp:cNvGraphicFramePr>
               <a:graphicFrameLocks xmlns:a="http://schemas.openxmlformats.org/drawingml/2006/main" noChangeAspect="1"/>
             </wp:cNvGraphicFramePr>
@@ -2698,7 +3169,7 @@
           <w:sz w:val="18"/>
           <w:szCs w:val="18"/>
         </w:rPr>
-        <w:t xml:space="preserve">Figure 8 - My orders</w:t>
+        <w:t xml:space="preserve">Figure 8 - Placing an order</w:t>
       </w:r>
     </w:p>
     <w:p>
@@ -2706,7 +3177,7 @@
         <w:pStyle w:val="Heading2"/>
       </w:pPr>
       <w:r>
-        <w:t xml:space="preserve">4.4 Connections</w:t>
+        <w:t xml:space="preserve">4.3 My orders</w:t>
       </w:r>
     </w:p>
     <w:p>
@@ -2718,10 +3189,20 @@
           <w:b/>
           <w:bCs/>
         </w:rPr>
-        <w:t xml:space="preserve">Connections</w:t>
-      </w:r>
-      <w:r>
-        <w:t xml:space="preserve"> lists your connections with their account IDs, plan, status (Active, Temporarily inactive, Permanently inactive) and the equipment supplied.</w:t>
+        <w:t xml:space="preserve">My orders</w:t>
+      </w:r>
+      <w:r>
+        <w:t xml:space="preserve"> lists every order with its status. Open an order to see its details. An order that has not yet been connected can be cancelled with </w:t>
+      </w:r>
+      <w:r>
+        <w:rPr>
+          <w:b/>
+          <w:bCs/>
+        </w:rPr>
+        <w:t xml:space="preserve">Cancel order</w:t>
+      </w:r>
+      <w:r>
+        <w:t xml:space="preserve">.</w:t>
       </w:r>
     </w:p>
     <w:p>
@@ -2735,7 +3216,7 @@
           <wp:inline distT="0" distB="0" distL="0" distR="0">
             <wp:extent cx="5715000" cy="3571875"/>
             <wp:effectExtent t="0" r="0" b="0" l="0"/>
-            <wp:docPr id="10" name="ug-customer-connections.jpg" descr="ug customer connections jpg" title="ug-customer-connections.jpg"/>
+            <wp:docPr id="10" name="ug-customer-orders.jpg" descr="ug customer orders jpg" title="ug-customer-orders.jpg"/>
             <wp:cNvGraphicFramePr>
               <a:graphicFrameLocks xmlns:a="http://schemas.openxmlformats.org/drawingml/2006/main" noChangeAspect="1"/>
             </wp:cNvGraphicFramePr>
@@ -2784,7 +3265,7 @@
           <w:sz w:val="18"/>
           <w:szCs w:val="18"/>
         </w:rPr>
-        <w:t xml:space="preserve">Figure 9 - My connections</w:t>
+        <w:t xml:space="preserve">Figure 9 - My orders</w:t>
       </w:r>
     </w:p>
     <w:p>
@@ -2792,7 +3273,7 @@
         <w:pStyle w:val="Heading2"/>
       </w:pPr>
       <w:r>
-        <w:t xml:space="preserve">4.5 Bills</w:t>
+        <w:t xml:space="preserve">4.4 Connections</w:t>
       </w:r>
     </w:p>
     <w:p>
@@ -2804,10 +3285,10 @@
           <w:b/>
           <w:bCs/>
         </w:rPr>
-        <w:t xml:space="preserve">Bills</w:t>
-      </w:r>
-      <w:r>
-        <w:t xml:space="preserve"> shows every bill, itemised: plan charge, call charges, deposit, discount and 12.24% service tax, with what has been paid and what is still due. Pay at any Nexus retail shop.</w:t>
+        <w:t xml:space="preserve">Connections</w:t>
+      </w:r>
+      <w:r>
+        <w:t xml:space="preserve"> lists your connections with their account IDs, plan, status (Active, Temporarily inactive, Permanently inactive) and the equipment supplied.</w:t>
       </w:r>
     </w:p>
     <w:p>
@@ -2821,7 +3302,7 @@
           <wp:inline distT="0" distB="0" distL="0" distR="0">
             <wp:extent cx="5715000" cy="3571875"/>
             <wp:effectExtent t="0" r="0" b="0" l="0"/>
-            <wp:docPr id="11" name="ui-customer-bills.jpg" descr="ui customer bills jpg" title="ui-customer-bills.jpg"/>
+            <wp:docPr id="11" name="ug-customer-connections.jpg" descr="ug customer connections jpg" title="ug-customer-connections.jpg"/>
             <wp:cNvGraphicFramePr>
               <a:graphicFrameLocks xmlns:a="http://schemas.openxmlformats.org/drawingml/2006/main" noChangeAspect="1"/>
             </wp:cNvGraphicFramePr>
@@ -2870,7 +3351,7 @@
           <w:sz w:val="18"/>
           <w:szCs w:val="18"/>
         </w:rPr>
-        <w:t xml:space="preserve">Figure 10 - Itemised bills</w:t>
+        <w:t xml:space="preserve">Figure 10 - My connections</w:t>
       </w:r>
     </w:p>
     <w:p>
@@ -2878,67 +3359,22 @@
         <w:pStyle w:val="Heading2"/>
       </w:pPr>
       <w:r>
-        <w:t xml:space="preserve">4.6 Documents, profile and feedback</w:t>
-      </w:r>
-    </w:p>
-    <w:p>
-      <w:pPr>
-        <w:pStyle w:val="ListParagraph"/>
-        <w:numPr>
-          <w:ilvl w:val="0"/>
-          <w:numId w:val="3"/>
-        </w:numPr>
-        <w:spacing w:after="60" w:line="276"/>
+        <w:t xml:space="preserve">4.5 Bills</w:t>
+      </w:r>
+    </w:p>
+    <w:p>
+      <w:pPr>
+        <w:spacing w:after="120" w:line="288"/>
       </w:pPr>
       <w:r>
         <w:rPr>
           <w:b/>
           <w:bCs/>
         </w:rPr>
-        <w:t xml:space="preserve">Documents</w:t>
-      </w:r>
-      <w:r>
-        <w:t xml:space="preserve"> - upload proof of identity or address (PDF or image) and download what you uploaded.</w:t>
-      </w:r>
-    </w:p>
-    <w:p>
-      <w:pPr>
-        <w:pStyle w:val="ListParagraph"/>
-        <w:numPr>
-          <w:ilvl w:val="0"/>
-          <w:numId w:val="3"/>
-        </w:numPr>
-        <w:spacing w:after="60" w:line="276"/>
-      </w:pPr>
-      <w:r>
-        <w:rPr>
-          <w:b/>
-          <w:bCs/>
-        </w:rPr>
-        <w:t xml:space="preserve">Profile</w:t>
-      </w:r>
-      <w:r>
-        <w:t xml:space="preserve"> - update your phone number, e-mail and address.</w:t>
-      </w:r>
-    </w:p>
-    <w:p>
-      <w:pPr>
-        <w:pStyle w:val="ListParagraph"/>
-        <w:numPr>
-          <w:ilvl w:val="0"/>
-          <w:numId w:val="3"/>
-        </w:numPr>
-        <w:spacing w:after="60" w:line="276"/>
-      </w:pPr>
-      <w:r>
-        <w:rPr>
-          <w:b/>
-          <w:bCs/>
-        </w:rPr>
-        <w:t xml:space="preserve">Feedback</w:t>
-      </w:r>
-      <w:r>
-        <w:t xml:space="preserve"> - send a comment or complaint to Nexus; the administrator reads every message.</w:t>
+        <w:t xml:space="preserve">Bills</w:t>
+      </w:r>
+      <w:r>
+        <w:t xml:space="preserve"> shows every bill, itemised: plan charge, call charges, deposit, discount and 12.24% service tax, with what has been paid and what is still due. Pay at any Nexus retail shop.</w:t>
       </w:r>
     </w:p>
     <w:p>
@@ -2952,7 +3388,7 @@
           <wp:inline distT="0" distB="0" distL="0" distR="0">
             <wp:extent cx="5715000" cy="3571875"/>
             <wp:effectExtent t="0" r="0" b="0" l="0"/>
-            <wp:docPr id="12" name="ug-customer-feedback.jpg" descr="ug customer feedback jpg" title="ug-customer-feedback.jpg"/>
+            <wp:docPr id="12" name="ui-customer-bills.jpg" descr="ui customer bills jpg" title="ui-customer-bills.jpg"/>
             <wp:cNvGraphicFramePr>
               <a:graphicFrameLocks xmlns:a="http://schemas.openxmlformats.org/drawingml/2006/main" noChangeAspect="1"/>
             </wp:cNvGraphicFramePr>
@@ -3001,24 +3437,75 @@
           <w:sz w:val="18"/>
           <w:szCs w:val="18"/>
         </w:rPr>
-        <w:t xml:space="preserve">Figure 11 - Feedback form</w:t>
-      </w:r>
-    </w:p>
-    <w:p>
-      <w:pPr>
-        <w:pStyle w:val="Heading1"/>
-        <w:pageBreakBefore/>
-      </w:pPr>
-      <w:r>
-        <w:t xml:space="preserve">5. Retail Shop Staff Guide</w:t>
-      </w:r>
-    </w:p>
-    <w:p>
-      <w:pPr>
-        <w:spacing w:after="120" w:line="288"/>
-      </w:pPr>
-      <w:r>
-        <w:t xml:space="preserve">Retail staff work for one shop. They see only their own shop's customers, orders and bills.</w:t>
+        <w:t xml:space="preserve">Figure 11 - Itemised bills</w:t>
+      </w:r>
+    </w:p>
+    <w:p>
+      <w:pPr>
+        <w:pStyle w:val="Heading2"/>
+      </w:pPr>
+      <w:r>
+        <w:t xml:space="preserve">4.6 Documents, profile and feedback</w:t>
+      </w:r>
+    </w:p>
+    <w:p>
+      <w:pPr>
+        <w:pStyle w:val="ListParagraph"/>
+        <w:numPr>
+          <w:ilvl w:val="0"/>
+          <w:numId w:val="3"/>
+        </w:numPr>
+        <w:spacing w:after="60" w:line="276"/>
+      </w:pPr>
+      <w:r>
+        <w:rPr>
+          <w:b/>
+          <w:bCs/>
+        </w:rPr>
+        <w:t xml:space="preserve">Documents</w:t>
+      </w:r>
+      <w:r>
+        <w:t xml:space="preserve"> - upload proof of identity or address (PDF or image) and download what you uploaded.</w:t>
+      </w:r>
+    </w:p>
+    <w:p>
+      <w:pPr>
+        <w:pStyle w:val="ListParagraph"/>
+        <w:numPr>
+          <w:ilvl w:val="0"/>
+          <w:numId w:val="3"/>
+        </w:numPr>
+        <w:spacing w:after="60" w:line="276"/>
+      </w:pPr>
+      <w:r>
+        <w:rPr>
+          <w:b/>
+          <w:bCs/>
+        </w:rPr>
+        <w:t xml:space="preserve">Profile</w:t>
+      </w:r>
+      <w:r>
+        <w:t xml:space="preserve"> - update your phone number, e-mail and address.</w:t>
+      </w:r>
+    </w:p>
+    <w:p>
+      <w:pPr>
+        <w:pStyle w:val="ListParagraph"/>
+        <w:numPr>
+          <w:ilvl w:val="0"/>
+          <w:numId w:val="3"/>
+        </w:numPr>
+        <w:spacing w:after="60" w:line="276"/>
+      </w:pPr>
+      <w:r>
+        <w:rPr>
+          <w:b/>
+          <w:bCs/>
+        </w:rPr>
+        <w:t xml:space="preserve">Feedback</w:t>
+      </w:r>
+      <w:r>
+        <w:t xml:space="preserve"> - send a comment or complaint to Nexus; the administrator reads every message.</w:t>
       </w:r>
     </w:p>
     <w:p>
@@ -3032,7 +3519,7 @@
           <wp:inline distT="0" distB="0" distL="0" distR="0">
             <wp:extent cx="5715000" cy="3571875"/>
             <wp:effectExtent t="0" r="0" b="0" l="0"/>
-            <wp:docPr id="13" name="ug-retail-dashboard.jpg" descr="ug retail dashboard jpg" title="ug-retail-dashboard.jpg"/>
+            <wp:docPr id="13" name="ug-customer-feedback.jpg" descr="ug customer feedback jpg" title="ug-customer-feedback.jpg"/>
             <wp:cNvGraphicFramePr>
               <a:graphicFrameLocks xmlns:a="http://schemas.openxmlformats.org/drawingml/2006/main" noChangeAspect="1"/>
             </wp:cNvGraphicFramePr>
@@ -3081,154 +3568,24 @@
           <w:sz w:val="18"/>
           <w:szCs w:val="18"/>
         </w:rPr>
-        <w:t xml:space="preserve">Figure 12 - Retail dashboard</w:t>
-      </w:r>
-    </w:p>
-    <w:p>
-      <w:pPr>
-        <w:pStyle w:val="Heading2"/>
-      </w:pPr>
-      <w:r>
-        <w:t xml:space="preserve">5.1 Registering a walk-in customer</w:t>
-      </w:r>
-    </w:p>
-    <w:p>
-      <w:pPr>
-        <w:pStyle w:val="ListParagraph"/>
-        <w:numPr>
-          <w:ilvl w:val="0"/>
-          <w:numId w:val="8"/>
-        </w:numPr>
-        <w:spacing w:after="60" w:line="276"/>
-      </w:pPr>
-      <w:r>
-        <w:t xml:space="preserve">Open </w:t>
-      </w:r>
-      <w:r>
-        <w:rPr>
-          <w:b/>
-          <w:bCs/>
-        </w:rPr>
-        <w:t xml:space="preserve">Customers</w:t>
-      </w:r>
-      <w:r>
-        <w:t xml:space="preserve"> and click </w:t>
-      </w:r>
-      <w:r>
-        <w:rPr>
-          <w:b/>
-          <w:bCs/>
-        </w:rPr>
-        <w:t xml:space="preserve">New customer</w:t>
-      </w:r>
-      <w:r>
-        <w:t xml:space="preserve">.</w:t>
-      </w:r>
-    </w:p>
-    <w:p>
-      <w:pPr>
-        <w:pStyle w:val="ListParagraph"/>
-        <w:numPr>
-          <w:ilvl w:val="0"/>
-          <w:numId w:val="8"/>
-        </w:numPr>
-        <w:spacing w:after="60" w:line="276"/>
-      </w:pPr>
-      <w:r>
-        <w:t xml:space="preserve">Enter the customer's details; the city is set to your shop's city.</w:t>
-      </w:r>
-    </w:p>
-    <w:p>
-      <w:pPr>
-        <w:pStyle w:val="ListParagraph"/>
-        <w:numPr>
-          <w:ilvl w:val="0"/>
-          <w:numId w:val="8"/>
-        </w:numPr>
-        <w:spacing w:after="60" w:line="276"/>
-      </w:pPr>
-      <w:r>
-        <w:t xml:space="preserve">Save. The customer can now be given an order.</w:t>
-      </w:r>
-    </w:p>
-    <w:p>
-      <w:pPr>
-        <w:pStyle w:val="Heading2"/>
-      </w:pPr>
-      <w:r>
-        <w:t xml:space="preserve">5.2 Placing an order for a customer</w:t>
-      </w:r>
-    </w:p>
-    <w:p>
-      <w:pPr>
-        <w:pStyle w:val="ListParagraph"/>
-        <w:numPr>
-          <w:ilvl w:val="0"/>
-          <w:numId w:val="9"/>
-        </w:numPr>
-        <w:spacing w:after="60" w:line="276"/>
-      </w:pPr>
-      <w:r>
-        <w:t xml:space="preserve">Open </w:t>
-      </w:r>
-      <w:r>
-        <w:rPr>
-          <w:b/>
-          <w:bCs/>
-        </w:rPr>
-        <w:t xml:space="preserve">Place order</w:t>
-      </w:r>
-      <w:r>
-        <w:t xml:space="preserve"> and choose the customer.</w:t>
-      </w:r>
-    </w:p>
-    <w:p>
-      <w:pPr>
-        <w:pStyle w:val="ListParagraph"/>
-        <w:numPr>
-          <w:ilvl w:val="0"/>
-          <w:numId w:val="9"/>
-        </w:numPr>
-        <w:spacing w:after="60" w:line="276"/>
-      </w:pPr>
-      <w:r>
-        <w:t xml:space="preserve">Choose the connection type and plan (and a landline plan when a Dial-Up customer has no landline).</w:t>
-      </w:r>
-    </w:p>
-    <w:p>
-      <w:pPr>
-        <w:pStyle w:val="ListParagraph"/>
-        <w:numPr>
-          <w:ilvl w:val="0"/>
-          <w:numId w:val="9"/>
-        </w:numPr>
-        <w:spacing w:after="60" w:line="276"/>
-      </w:pPr>
-      <w:r>
-        <w:t xml:space="preserve">Enter the installation address and the number of connections, then click </w:t>
-      </w:r>
-      <w:r>
-        <w:rPr>
-          <w:b/>
-          <w:bCs/>
-        </w:rPr>
-        <w:t xml:space="preserve">Place order</w:t>
-      </w:r>
-      <w:r>
-        <w:t xml:space="preserve">.</w:t>
-      </w:r>
-    </w:p>
-    <w:p>
-      <w:pPr>
-        <w:pStyle w:val="ListParagraph"/>
-        <w:numPr>
-          <w:ilvl w:val="0"/>
-          <w:numId w:val="9"/>
-        </w:numPr>
-        <w:spacing w:after="60" w:line="276"/>
-      </w:pPr>
-      <w:r>
-        <w:t xml:space="preserve">Give the customer the order number printed on the confirmation.</w:t>
+        <w:t xml:space="preserve">Figure 12 - Feedback form</w:t>
+      </w:r>
+    </w:p>
+    <w:p>
+      <w:pPr>
+        <w:pStyle w:val="Heading1"/>
+        <w:pageBreakBefore/>
+      </w:pPr>
+      <w:r>
+        <w:t xml:space="preserve">5. Retail Shop Staff Guide</w:t>
+      </w:r>
+    </w:p>
+    <w:p>
+      <w:pPr>
+        <w:spacing w:after="120" w:line="288"/>
+      </w:pPr>
+      <w:r>
+        <w:t xml:space="preserve">Retail staff work for one shop. They see only their own shop's customers, orders and bills.</w:t>
       </w:r>
     </w:p>
     <w:p>
@@ -3242,7 +3599,7 @@
           <wp:inline distT="0" distB="0" distL="0" distR="0">
             <wp:extent cx="5715000" cy="3571875"/>
             <wp:effectExtent t="0" r="0" b="0" l="0"/>
-            <wp:docPr id="14" name="ui-retail-order.jpg" descr="ui retail order jpg" title="ui-retail-order.jpg"/>
+            <wp:docPr id="14" name="ug-retail-dashboard.jpg" descr="ug retail dashboard jpg" title="ug-retail-dashboard.jpg"/>
             <wp:cNvGraphicFramePr>
               <a:graphicFrameLocks xmlns:a="http://schemas.openxmlformats.org/drawingml/2006/main" noChangeAspect="1"/>
             </wp:cNvGraphicFramePr>
@@ -3291,7 +3648,7 @@
           <w:sz w:val="18"/>
           <w:szCs w:val="18"/>
         </w:rPr>
-        <w:t xml:space="preserve">Figure 13 - Placing an order at the shop</w:t>
+        <w:t xml:space="preserve">Figure 13 - Retail dashboard</w:t>
       </w:r>
     </w:p>
     <w:p>
@@ -3299,7 +3656,7 @@
         <w:pStyle w:val="Heading2"/>
       </w:pPr>
       <w:r>
-        <w:t xml:space="preserve">5.3 Collecting a bill payment</w:t>
+        <w:t xml:space="preserve">5.1 Registering a walk-in customer</w:t>
       </w:r>
     </w:p>
     <w:p>
@@ -3307,7 +3664,7 @@
         <w:pStyle w:val="ListParagraph"/>
         <w:numPr>
           <w:ilvl w:val="0"/>
-          <w:numId w:val="10"/>
+          <w:numId w:val="8"/>
         </w:numPr>
         <w:spacing w:after="60" w:line="276"/>
       </w:pPr>
@@ -3319,10 +3676,20 @@
           <w:b/>
           <w:bCs/>
         </w:rPr>
-        <w:t xml:space="preserve">Collect payment</w:t>
-      </w:r>
-      <w:r>
-        <w:t xml:space="preserve">. Bills with money still due are listed.</w:t>
+        <w:t xml:space="preserve">Customers</w:t>
+      </w:r>
+      <w:r>
+        <w:t xml:space="preserve"> and click </w:t>
+      </w:r>
+      <w:r>
+        <w:rPr>
+          <w:b/>
+          <w:bCs/>
+        </w:rPr>
+        <w:t xml:space="preserve">New customer</w:t>
+      </w:r>
+      <w:r>
+        <w:t xml:space="preserve">.</w:t>
       </w:r>
     </w:p>
     <w:p>
@@ -3330,22 +3697,12 @@
         <w:pStyle w:val="ListParagraph"/>
         <w:numPr>
           <w:ilvl w:val="0"/>
-          <w:numId w:val="10"/>
+          <w:numId w:val="8"/>
         </w:numPr>
         <w:spacing w:after="60" w:line="276"/>
       </w:pPr>
       <w:r>
-        <w:t xml:space="preserve">Click </w:t>
-      </w:r>
-      <w:r>
-        <w:rPr>
-          <w:b/>
-          <w:bCs/>
-        </w:rPr>
-        <w:t xml:space="preserve">Record payment</w:t>
-      </w:r>
-      <w:r>
-        <w:t xml:space="preserve"> next to the bill, enter the amount and payment method, and save.</w:t>
+        <w:t xml:space="preserve">Enter the customer's details; the city is set to your shop's city.</w:t>
       </w:r>
     </w:p>
     <w:p>
@@ -3353,12 +3710,92 @@
         <w:pStyle w:val="ListParagraph"/>
         <w:numPr>
           <w:ilvl w:val="0"/>
-          <w:numId w:val="10"/>
+          <w:numId w:val="8"/>
         </w:numPr>
         <w:spacing w:after="60" w:line="276"/>
       </w:pPr>
       <w:r>
-        <w:t xml:space="preserve">The bill status changes to Partially paid or Paid. Earlier unpaid bills are paid first.</w:t>
+        <w:t xml:space="preserve">Save. The customer can now be given an order.</w:t>
+      </w:r>
+    </w:p>
+    <w:p>
+      <w:pPr>
+        <w:pStyle w:val="Heading2"/>
+      </w:pPr>
+      <w:r>
+        <w:t xml:space="preserve">5.2 Placing an order for a customer</w:t>
+      </w:r>
+    </w:p>
+    <w:p>
+      <w:pPr>
+        <w:pStyle w:val="ListParagraph"/>
+        <w:numPr>
+          <w:ilvl w:val="0"/>
+          <w:numId w:val="9"/>
+        </w:numPr>
+        <w:spacing w:after="60" w:line="276"/>
+      </w:pPr>
+      <w:r>
+        <w:t xml:space="preserve">Open </w:t>
+      </w:r>
+      <w:r>
+        <w:rPr>
+          <w:b/>
+          <w:bCs/>
+        </w:rPr>
+        <w:t xml:space="preserve">Place order</w:t>
+      </w:r>
+      <w:r>
+        <w:t xml:space="preserve"> and choose the customer.</w:t>
+      </w:r>
+    </w:p>
+    <w:p>
+      <w:pPr>
+        <w:pStyle w:val="ListParagraph"/>
+        <w:numPr>
+          <w:ilvl w:val="0"/>
+          <w:numId w:val="9"/>
+        </w:numPr>
+        <w:spacing w:after="60" w:line="276"/>
+      </w:pPr>
+      <w:r>
+        <w:t xml:space="preserve">Choose the connection type and plan (and a landline plan when a Dial-Up customer has no landline).</w:t>
+      </w:r>
+    </w:p>
+    <w:p>
+      <w:pPr>
+        <w:pStyle w:val="ListParagraph"/>
+        <w:numPr>
+          <w:ilvl w:val="0"/>
+          <w:numId w:val="9"/>
+        </w:numPr>
+        <w:spacing w:after="60" w:line="276"/>
+      </w:pPr>
+      <w:r>
+        <w:t xml:space="preserve">Enter the installation address and the number of connections, then click </w:t>
+      </w:r>
+      <w:r>
+        <w:rPr>
+          <w:b/>
+          <w:bCs/>
+        </w:rPr>
+        <w:t xml:space="preserve">Place order</w:t>
+      </w:r>
+      <w:r>
+        <w:t xml:space="preserve">.</w:t>
+      </w:r>
+    </w:p>
+    <w:p>
+      <w:pPr>
+        <w:pStyle w:val="ListParagraph"/>
+        <w:numPr>
+          <w:ilvl w:val="0"/>
+          <w:numId w:val="9"/>
+        </w:numPr>
+        <w:spacing w:after="60" w:line="276"/>
+      </w:pPr>
+      <w:r>
+        <w:t xml:space="preserve">Give the customer the order number printed on the confirmation.</w:t>
       </w:r>
     </w:p>
     <w:p>
@@ -3372,7 +3809,7 @@
           <wp:inline distT="0" distB="0" distL="0" distR="0">
             <wp:extent cx="5715000" cy="3571875"/>
             <wp:effectExtent t="0" r="0" b="0" l="0"/>
-            <wp:docPr id="15" name="ui-retail-payments.jpg" descr="ui retail payments jpg" title="ui-retail-payments.jpg"/>
+            <wp:docPr id="15" name="ui-retail-order.jpg" descr="ui retail order jpg" title="ui-retail-order.jpg"/>
             <wp:cNvGraphicFramePr>
               <a:graphicFrameLocks xmlns:a="http://schemas.openxmlformats.org/drawingml/2006/main" noChangeAspect="1"/>
             </wp:cNvGraphicFramePr>
@@ -3421,16 +3858,74 @@
           <w:sz w:val="18"/>
           <w:szCs w:val="18"/>
         </w:rPr>
-        <w:t xml:space="preserve">Figure 14 - Bills the shop can collect</w:t>
-      </w:r>
-    </w:p>
-    <w:p>
-      <w:pPr>
-        <w:pStyle w:val="Heading1"/>
-        <w:pageBreakBefore/>
-      </w:pPr>
-      <w:r>
-        <w:t xml:space="preserve">6. Technical Staff Guide</w:t>
+        <w:t xml:space="preserve">Figure 14 - Placing an order at the shop</w:t>
+      </w:r>
+    </w:p>
+    <w:p>
+      <w:pPr>
+        <w:pStyle w:val="Heading2"/>
+      </w:pPr>
+      <w:r>
+        <w:t xml:space="preserve">5.3 Collecting a bill payment</w:t>
+      </w:r>
+    </w:p>
+    <w:p>
+      <w:pPr>
+        <w:pStyle w:val="ListParagraph"/>
+        <w:numPr>
+          <w:ilvl w:val="0"/>
+          <w:numId w:val="10"/>
+        </w:numPr>
+        <w:spacing w:after="60" w:line="276"/>
+      </w:pPr>
+      <w:r>
+        <w:t xml:space="preserve">Open </w:t>
+      </w:r>
+      <w:r>
+        <w:rPr>
+          <w:b/>
+          <w:bCs/>
+        </w:rPr>
+        <w:t xml:space="preserve">Collect payment</w:t>
+      </w:r>
+      <w:r>
+        <w:t xml:space="preserve">. Bills with money still due are listed.</w:t>
+      </w:r>
+    </w:p>
+    <w:p>
+      <w:pPr>
+        <w:pStyle w:val="ListParagraph"/>
+        <w:numPr>
+          <w:ilvl w:val="0"/>
+          <w:numId w:val="10"/>
+        </w:numPr>
+        <w:spacing w:after="60" w:line="276"/>
+      </w:pPr>
+      <w:r>
+        <w:t xml:space="preserve">Click </w:t>
+      </w:r>
+      <w:r>
+        <w:rPr>
+          <w:b/>
+          <w:bCs/>
+        </w:rPr>
+        <w:t xml:space="preserve">Record payment</w:t>
+      </w:r>
+      <w:r>
+        <w:t xml:space="preserve"> next to the bill, enter the amount and payment method, and save.</w:t>
+      </w:r>
+    </w:p>
+    <w:p>
+      <w:pPr>
+        <w:pStyle w:val="ListParagraph"/>
+        <w:numPr>
+          <w:ilvl w:val="0"/>
+          <w:numId w:val="10"/>
+        </w:numPr>
+        <w:spacing w:after="60" w:line="276"/>
+      </w:pPr>
+      <w:r>
+        <w:t xml:space="preserve">The bill status changes to Partially paid or Paid. Earlier unpaid bills are paid first.</w:t>
       </w:r>
     </w:p>
     <w:p>
@@ -3444,7 +3939,7 @@
           <wp:inline distT="0" distB="0" distL="0" distR="0">
             <wp:extent cx="5715000" cy="3571875"/>
             <wp:effectExtent t="0" r="0" b="0" l="0"/>
-            <wp:docPr id="16" name="ui-tech-dashboard.jpg" descr="ui tech dashboard jpg" title="ui-tech-dashboard.jpg"/>
+            <wp:docPr id="16" name="ui-retail-payments.jpg" descr="ui retail payments jpg" title="ui-retail-payments.jpg"/>
             <wp:cNvGraphicFramePr>
               <a:graphicFrameLocks xmlns:a="http://schemas.openxmlformats.org/drawingml/2006/main" noChangeAspect="1"/>
             </wp:cNvGraphicFramePr>
@@ -3493,127 +3988,16 @@
           <w:sz w:val="18"/>
           <w:szCs w:val="18"/>
         </w:rPr>
-        <w:t xml:space="preserve">Figure 15 - Technical dashboard</w:t>
-      </w:r>
-    </w:p>
-    <w:p>
-      <w:pPr>
-        <w:pStyle w:val="Heading2"/>
-      </w:pPr>
-      <w:r>
-        <w:t xml:space="preserve">6.1 Feasibility check</w:t>
-      </w:r>
-    </w:p>
-    <w:p>
-      <w:pPr>
-        <w:pStyle w:val="ListParagraph"/>
-        <w:numPr>
-          <w:ilvl w:val="0"/>
-          <w:numId w:val="11"/>
-        </w:numPr>
-        <w:spacing w:after="60" w:line="276"/>
-      </w:pPr>
-      <w:r>
-        <w:t xml:space="preserve">Open </w:t>
-      </w:r>
-      <w:r>
-        <w:rPr>
-          <w:b/>
-          <w:bCs/>
-        </w:rPr>
-        <w:t xml:space="preserve">Feasibility</w:t>
-      </w:r>
-      <w:r>
-        <w:t xml:space="preserve">. New orders waiting for a check are listed.</w:t>
-      </w:r>
-    </w:p>
-    <w:p>
-      <w:pPr>
-        <w:pStyle w:val="ListParagraph"/>
-        <w:numPr>
-          <w:ilvl w:val="0"/>
-          <w:numId w:val="11"/>
-        </w:numPr>
-        <w:spacing w:after="60" w:line="276"/>
-      </w:pPr>
-      <w:r>
-        <w:t xml:space="preserve">Click </w:t>
-      </w:r>
-      <w:r>
-        <w:rPr>
-          <w:b/>
-          <w:bCs/>
-        </w:rPr>
-        <w:t xml:space="preserve">Start checks</w:t>
-      </w:r>
-      <w:r>
-        <w:t xml:space="preserve"> on an order. A distance check and a server-capacity check are created.</w:t>
-      </w:r>
-    </w:p>
-    <w:p>
-      <w:pPr>
-        <w:pStyle w:val="ListParagraph"/>
-        <w:numPr>
-          <w:ilvl w:val="0"/>
-          <w:numId w:val="11"/>
-        </w:numPr>
-        <w:spacing w:after="60" w:line="276"/>
-      </w:pPr>
-      <w:r>
-        <w:t xml:space="preserve">Click </w:t>
-      </w:r>
-      <w:r>
-        <w:rPr>
-          <w:b/>
-          <w:bCs/>
-        </w:rPr>
-        <w:t xml:space="preserve">Record result</w:t>
-      </w:r>
-      <w:r>
-        <w:t xml:space="preserve"> on each check, choose </w:t>
-      </w:r>
-      <w:r>
-        <w:rPr>
-          <w:b/>
-          <w:bCs/>
-        </w:rPr>
-        <w:t xml:space="preserve">Feasible</w:t>
-      </w:r>
-      <w:r>
-        <w:t xml:space="preserve"> or </w:t>
-      </w:r>
-      <w:r>
-        <w:rPr>
-          <w:b/>
-          <w:bCs/>
-        </w:rPr>
-        <w:t xml:space="preserve">Not feasible</w:t>
-      </w:r>
-      <w:r>
-        <w:t xml:space="preserve">, add remarks and click </w:t>
-      </w:r>
-      <w:r>
-        <w:rPr>
-          <w:b/>
-          <w:bCs/>
-        </w:rPr>
-        <w:t xml:space="preserve">Save result</w:t>
-      </w:r>
-      <w:r>
-        <w:t xml:space="preserve">.</w:t>
-      </w:r>
-    </w:p>
-    <w:p>
-      <w:pPr>
-        <w:pStyle w:val="ListParagraph"/>
-        <w:numPr>
-          <w:ilvl w:val="0"/>
-          <w:numId w:val="11"/>
-        </w:numPr>
-        <w:spacing w:after="60" w:line="276"/>
-      </w:pPr>
-      <w:r>
-        <w:t xml:space="preserve">When both checks are feasible the order becomes Feasible; the customer sees the result when tracking it.</w:t>
+        <w:t xml:space="preserve">Figure 15 - Bills the shop can collect</w:t>
+      </w:r>
+    </w:p>
+    <w:p>
+      <w:pPr>
+        <w:pStyle w:val="Heading1"/>
+        <w:pageBreakBefore/>
+      </w:pPr>
+      <w:r>
+        <w:t xml:space="preserve">6. Technical Staff Guide</w:t>
       </w:r>
     </w:p>
     <w:p>
@@ -3627,7 +4011,7 @@
           <wp:inline distT="0" distB="0" distL="0" distR="0">
             <wp:extent cx="5715000" cy="3571875"/>
             <wp:effectExtent t="0" r="0" b="0" l="0"/>
-            <wp:docPr id="17" name="ui-tech-feasibility.jpg" descr="ui tech feasibility jpg" title="ui-tech-feasibility.jpg"/>
+            <wp:docPr id="17" name="ui-tech-dashboard.jpg" descr="ui tech dashboard jpg" title="ui-tech-dashboard.jpg"/>
             <wp:cNvGraphicFramePr>
               <a:graphicFrameLocks xmlns:a="http://schemas.openxmlformats.org/drawingml/2006/main" noChangeAspect="1"/>
             </wp:cNvGraphicFramePr>
@@ -3676,7 +4060,7 @@
           <w:sz w:val="18"/>
           <w:szCs w:val="18"/>
         </w:rPr>
-        <w:t xml:space="preserve">Figure 16 - Feasibility queue</w:t>
+        <w:t xml:space="preserve">Figure 16 - Technical dashboard</w:t>
       </w:r>
     </w:p>
     <w:p>
@@ -3684,7 +4068,7 @@
         <w:pStyle w:val="Heading2"/>
       </w:pPr>
       <w:r>
-        <w:t xml:space="preserve">6.2 Creating a connection</w:t>
+        <w:t xml:space="preserve">6.1 Feasibility check</w:t>
       </w:r>
     </w:p>
     <w:p>
@@ -3692,22 +4076,22 @@
         <w:pStyle w:val="ListParagraph"/>
         <w:numPr>
           <w:ilvl w:val="0"/>
-          <w:numId w:val="12"/>
+          <w:numId w:val="11"/>
         </w:numPr>
         <w:spacing w:after="60" w:line="276"/>
       </w:pPr>
       <w:r>
-        <w:t xml:space="preserve">On the Feasibility page click </w:t>
+        <w:t xml:space="preserve">Open </w:t>
       </w:r>
       <w:r>
         <w:rPr>
           <w:b/>
           <w:bCs/>
         </w:rPr>
-        <w:t xml:space="preserve">Provision</w:t>
-      </w:r>
-      <w:r>
-        <w:t xml:space="preserve"> next to a feasible order.</w:t>
+        <w:t xml:space="preserve">Feasibility</w:t>
+      </w:r>
+      <w:r>
+        <w:t xml:space="preserve">. New orders waiting for a check are listed.</w:t>
       </w:r>
     </w:p>
     <w:p>
@@ -3715,12 +4099,22 @@
         <w:pStyle w:val="ListParagraph"/>
         <w:numPr>
           <w:ilvl w:val="0"/>
-          <w:numId w:val="12"/>
+          <w:numId w:val="11"/>
         </w:numPr>
         <w:spacing w:after="60" w:line="276"/>
       </w:pPr>
       <w:r>
-        <w:t xml:space="preserve">Enter the phone number (landline), choose the equipment to supply and its serial number - stock is reduced automatically.</w:t>
+        <w:t xml:space="preserve">Click </w:t>
+      </w:r>
+      <w:r>
+        <w:rPr>
+          <w:b/>
+          <w:bCs/>
+        </w:rPr>
+        <w:t xml:space="preserve">Start checks</w:t>
+      </w:r>
+      <w:r>
+        <w:t xml:space="preserve"> on an order. A distance check and a server-capacity check are created.</w:t>
       </w:r>
     </w:p>
     <w:p>
@@ -3728,7 +4122,7 @@
         <w:pStyle w:val="ListParagraph"/>
         <w:numPr>
           <w:ilvl w:val="0"/>
-          <w:numId w:val="12"/>
+          <w:numId w:val="11"/>
         </w:numPr>
         <w:spacing w:after="60" w:line="276"/>
       </w:pPr>
@@ -3740,10 +4134,53 @@
           <w:b/>
           <w:bCs/>
         </w:rPr>
-        <w:t xml:space="preserve">Provision connections</w:t>
-      </w:r>
-      <w:r>
-        <w:t xml:space="preserve">. The system creates the connection and its 16-character account ID.</w:t>
+        <w:t xml:space="preserve">Record result</w:t>
+      </w:r>
+      <w:r>
+        <w:t xml:space="preserve"> on each check, choose </w:t>
+      </w:r>
+      <w:r>
+        <w:rPr>
+          <w:b/>
+          <w:bCs/>
+        </w:rPr>
+        <w:t xml:space="preserve">Feasible</w:t>
+      </w:r>
+      <w:r>
+        <w:t xml:space="preserve"> or </w:t>
+      </w:r>
+      <w:r>
+        <w:rPr>
+          <w:b/>
+          <w:bCs/>
+        </w:rPr>
+        <w:t xml:space="preserve">Not feasible</w:t>
+      </w:r>
+      <w:r>
+        <w:t xml:space="preserve">, add remarks and click </w:t>
+      </w:r>
+      <w:r>
+        <w:rPr>
+          <w:b/>
+          <w:bCs/>
+        </w:rPr>
+        <w:t xml:space="preserve">Save result</w:t>
+      </w:r>
+      <w:r>
+        <w:t xml:space="preserve">.</w:t>
+      </w:r>
+    </w:p>
+    <w:p>
+      <w:pPr>
+        <w:pStyle w:val="ListParagraph"/>
+        <w:numPr>
+          <w:ilvl w:val="0"/>
+          <w:numId w:val="11"/>
+        </w:numPr>
+        <w:spacing w:after="60" w:line="276"/>
+      </w:pPr>
+      <w:r>
+        <w:t xml:space="preserve">When both checks are feasible the order becomes Feasible; the customer sees the result when tracking it.</w:t>
       </w:r>
     </w:p>
     <w:p>
@@ -3757,7 +4194,7 @@
           <wp:inline distT="0" distB="0" distL="0" distR="0">
             <wp:extent cx="5715000" cy="3571875"/>
             <wp:effectExtent t="0" r="0" b="0" l="0"/>
-            <wp:docPr id="18" name="ug-tech-connections.jpg" descr="ug tech connections jpg" title="ug-tech-connections.jpg"/>
+            <wp:docPr id="18" name="ui-tech-feasibility.jpg" descr="ui tech feasibility jpg" title="ui-tech-feasibility.jpg"/>
             <wp:cNvGraphicFramePr>
               <a:graphicFrameLocks xmlns:a="http://schemas.openxmlformats.org/drawingml/2006/main" noChangeAspect="1"/>
             </wp:cNvGraphicFramePr>
@@ -3806,7 +4243,7 @@
           <w:sz w:val="18"/>
           <w:szCs w:val="18"/>
         </w:rPr>
-        <w:t xml:space="preserve">Figure 17 - Connections</w:t>
+        <w:t xml:space="preserve">Figure 17 - Feasibility queue</w:t>
       </w:r>
     </w:p>
     <w:p>
@@ -3814,52 +4251,66 @@
         <w:pStyle w:val="Heading2"/>
       </w:pPr>
       <w:r>
-        <w:t xml:space="preserve">6.3 Overdue bills - suspend and reactivate</w:t>
-      </w:r>
-    </w:p>
-    <w:p>
-      <w:pPr>
-        <w:spacing w:after="120" w:line="288"/>
-      </w:pPr>
+        <w:t xml:space="preserve">6.2 Creating a connection</w:t>
+      </w:r>
+    </w:p>
+    <w:p>
+      <w:pPr>
+        <w:pStyle w:val="ListParagraph"/>
+        <w:numPr>
+          <w:ilvl w:val="0"/>
+          <w:numId w:val="12"/>
+        </w:numPr>
+        <w:spacing w:after="60" w:line="276"/>
+      </w:pPr>
+      <w:r>
+        <w:t xml:space="preserve">On the Feasibility page click </w:t>
+      </w:r>
       <w:r>
         <w:rPr>
           <w:b/>
           <w:bCs/>
         </w:rPr>
-        <w:t xml:space="preserve">Overdue</w:t>
-      </w:r>
-      <w:r>
-        <w:t xml:space="preserve"> lists active connections that have a bill past its due date. Click </w:t>
+        <w:t xml:space="preserve">Provision</w:t>
+      </w:r>
+      <w:r>
+        <w:t xml:space="preserve"> next to a feasible order.</w:t>
+      </w:r>
+    </w:p>
+    <w:p>
+      <w:pPr>
+        <w:pStyle w:val="ListParagraph"/>
+        <w:numPr>
+          <w:ilvl w:val="0"/>
+          <w:numId w:val="12"/>
+        </w:numPr>
+        <w:spacing w:after="60" w:line="276"/>
+      </w:pPr>
+      <w:r>
+        <w:t xml:space="preserve">Enter the phone number (landline), choose the equipment to supply and its serial number - stock is reduced automatically.</w:t>
+      </w:r>
+    </w:p>
+    <w:p>
+      <w:pPr>
+        <w:pStyle w:val="ListParagraph"/>
+        <w:numPr>
+          <w:ilvl w:val="0"/>
+          <w:numId w:val="12"/>
+        </w:numPr>
+        <w:spacing w:after="60" w:line="276"/>
+      </w:pPr>
+      <w:r>
+        <w:t xml:space="preserve">Click </w:t>
       </w:r>
       <w:r>
         <w:rPr>
           <w:b/>
           <w:bCs/>
         </w:rPr>
-        <w:t xml:space="preserve">Suspend</w:t>
-      </w:r>
-      <w:r>
-        <w:t xml:space="preserve"> for one connection or </w:t>
-      </w:r>
-      <w:r>
-        <w:rPr>
-          <w:b/>
-          <w:bCs/>
-        </w:rPr>
-        <w:t xml:space="preserve">Suspend all</w:t>
-      </w:r>
-      <w:r>
-        <w:t xml:space="preserve">. When every bill of a suspended connection has been paid, it appears with a </w:t>
-      </w:r>
-      <w:r>
-        <w:rPr>
-          <w:b/>
-          <w:bCs/>
-        </w:rPr>
-        <w:t xml:space="preserve">Reactivate</w:t>
-      </w:r>
-      <w:r>
-        <w:t xml:space="preserve"> button.</w:t>
+        <w:t xml:space="preserve">Provision connections</w:t>
+      </w:r>
+      <w:r>
+        <w:t xml:space="preserve">. The system creates the connection and its 16-character account ID.</w:t>
       </w:r>
     </w:p>
     <w:p>
@@ -3873,7 +4324,7 @@
           <wp:inline distT="0" distB="0" distL="0" distR="0">
             <wp:extent cx="5715000" cy="3571875"/>
             <wp:effectExtent t="0" r="0" b="0" l="0"/>
-            <wp:docPr id="19" name="ui-tech-overdue.jpg" descr="ui tech overdue jpg" title="ui-tech-overdue.jpg"/>
+            <wp:docPr id="19" name="ug-tech-connections.jpg" descr="ug tech connections jpg" title="ug-tech-connections.jpg"/>
             <wp:cNvGraphicFramePr>
               <a:graphicFrameLocks xmlns:a="http://schemas.openxmlformats.org/drawingml/2006/main" noChangeAspect="1"/>
             </wp:cNvGraphicFramePr>
@@ -3922,7 +4373,7 @@
           <w:sz w:val="18"/>
           <w:szCs w:val="18"/>
         </w:rPr>
-        <w:t xml:space="preserve">Figure 18 - Overdue connections</w:t>
+        <w:t xml:space="preserve">Figure 18 - Connections</w:t>
       </w:r>
     </w:p>
     <w:p>
@@ -3930,42 +4381,52 @@
         <w:pStyle w:val="Heading2"/>
       </w:pPr>
       <w:r>
-        <w:t xml:space="preserve">6.4 Other tasks</w:t>
-      </w:r>
-    </w:p>
-    <w:p>
-      <w:pPr>
-        <w:pStyle w:val="ListParagraph"/>
-        <w:numPr>
-          <w:ilvl w:val="0"/>
-          <w:numId w:val="3"/>
-        </w:numPr>
-        <w:spacing w:after="60" w:line="276"/>
-      </w:pPr>
-      <w:r>
-        <w:t xml:space="preserve">Change a connection's plan, or close it permanently (the deposit becomes refundable).</w:t>
-      </w:r>
-    </w:p>
-    <w:p>
-      <w:pPr>
-        <w:pStyle w:val="ListParagraph"/>
-        <w:numPr>
-          <w:ilvl w:val="0"/>
-          <w:numId w:val="3"/>
-        </w:numPr>
-        <w:spacing w:after="60" w:line="276"/>
-      </w:pPr>
-      <w:r>
-        <w:t xml:space="preserve">Replace faulty equipment; the old item is recorded and the new one is taken from stock.</w:t>
-      </w:r>
-    </w:p>
-    <w:p>
-      <w:pPr>
-        <w:pStyle w:val="Heading1"/>
-        <w:pageBreakBefore/>
-      </w:pPr>
-      <w:r>
-        <w:t xml:space="preserve">7. Accounts Staff Guide</w:t>
+        <w:t xml:space="preserve">6.3 Overdue bills - suspend and reactivate</w:t>
+      </w:r>
+    </w:p>
+    <w:p>
+      <w:pPr>
+        <w:spacing w:after="120" w:line="288"/>
+      </w:pPr>
+      <w:r>
+        <w:rPr>
+          <w:b/>
+          <w:bCs/>
+        </w:rPr>
+        <w:t xml:space="preserve">Overdue</w:t>
+      </w:r>
+      <w:r>
+        <w:t xml:space="preserve"> lists active connections that have a bill past its due date. Click </w:t>
+      </w:r>
+      <w:r>
+        <w:rPr>
+          <w:b/>
+          <w:bCs/>
+        </w:rPr>
+        <w:t xml:space="preserve">Suspend</w:t>
+      </w:r>
+      <w:r>
+        <w:t xml:space="preserve"> for one connection or </w:t>
+      </w:r>
+      <w:r>
+        <w:rPr>
+          <w:b/>
+          <w:bCs/>
+        </w:rPr>
+        <w:t xml:space="preserve">Suspend all</w:t>
+      </w:r>
+      <w:r>
+        <w:t xml:space="preserve">. When every bill of a suspended connection has been paid, it appears with a </w:t>
+      </w:r>
+      <w:r>
+        <w:rPr>
+          <w:b/>
+          <w:bCs/>
+        </w:rPr>
+        <w:t xml:space="preserve">Reactivate</w:t>
+      </w:r>
+      <w:r>
+        <w:t xml:space="preserve"> button.</w:t>
       </w:r>
     </w:p>
     <w:p>
@@ -3979,7 +4440,7 @@
           <wp:inline distT="0" distB="0" distL="0" distR="0">
             <wp:extent cx="5715000" cy="3571875"/>
             <wp:effectExtent t="0" r="0" b="0" l="0"/>
-            <wp:docPr id="20" name="ui-accounts-dashboard.jpg" descr="ui accounts dashboard jpg" title="ui-accounts-dashboard.jpg"/>
+            <wp:docPr id="20" name="ui-tech-overdue.jpg" descr="ui tech overdue jpg" title="ui-tech-overdue.jpg"/>
             <wp:cNvGraphicFramePr>
               <a:graphicFrameLocks xmlns:a="http://schemas.openxmlformats.org/drawingml/2006/main" noChangeAspect="1"/>
             </wp:cNvGraphicFramePr>
@@ -4028,7 +4489,7 @@
           <w:sz w:val="18"/>
           <w:szCs w:val="18"/>
         </w:rPr>
-        <w:t xml:space="preserve">Figure 19 - Accounts dashboard</w:t>
+        <w:t xml:space="preserve">Figure 19 - Overdue connections</w:t>
       </w:r>
     </w:p>
     <w:p>
@@ -4036,7 +4497,7 @@
         <w:pStyle w:val="Heading2"/>
       </w:pPr>
       <w:r>
-        <w:t xml:space="preserve">7.1 Generating a bill</w:t>
+        <w:t xml:space="preserve">6.4 Other tasks</w:t>
       </w:r>
     </w:p>
     <w:p>
@@ -4044,22 +4505,12 @@
         <w:pStyle w:val="ListParagraph"/>
         <w:numPr>
           <w:ilvl w:val="0"/>
-          <w:numId w:val="13"/>
+          <w:numId w:val="3"/>
         </w:numPr>
         <w:spacing w:after="60" w:line="276"/>
       </w:pPr>
       <w:r>
-        <w:t xml:space="preserve">Open </w:t>
-      </w:r>
-      <w:r>
-        <w:rPr>
-          <w:b/>
-          <w:bCs/>
-        </w:rPr>
-        <w:t xml:space="preserve">Generate bill</w:t>
-      </w:r>
-      <w:r>
-        <w:t xml:space="preserve"> and choose the connection and the billing period.</w:t>
+        <w:t xml:space="preserve">Change a connection's plan, or close it permanently (the deposit becomes refundable).</w:t>
       </w:r>
     </w:p>
     <w:p>
@@ -4067,58 +4518,21 @@
         <w:pStyle w:val="ListParagraph"/>
         <w:numPr>
           <w:ilvl w:val="0"/>
-          <w:numId w:val="13"/>
+          <w:numId w:val="3"/>
         </w:numPr>
         <w:spacing w:after="60" w:line="276"/>
       </w:pPr>
       <w:r>
-        <w:t xml:space="preserve">For a landline, enter the local, STD and mobile call minutes and any other usage charge.</w:t>
-      </w:r>
-    </w:p>
-    <w:p>
-      <w:pPr>
-        <w:pStyle w:val="ListParagraph"/>
-        <w:numPr>
-          <w:ilvl w:val="0"/>
-          <w:numId w:val="13"/>
-        </w:numPr>
-        <w:spacing w:after="60" w:line="276"/>
-      </w:pPr>
-      <w:r>
-        <w:t xml:space="preserve">Check the </w:t>
-      </w:r>
-      <w:r>
-        <w:rPr>
-          <w:b/>
-          <w:bCs/>
-        </w:rPr>
-        <w:t xml:space="preserve">charges preview</w:t>
-      </w:r>
-      <w:r>
-        <w:t xml:space="preserve">: plan charge, calls, deposit on the first bill, bulk discount and 12.24% tax.</w:t>
-      </w:r>
-    </w:p>
-    <w:p>
-      <w:pPr>
-        <w:pStyle w:val="ListParagraph"/>
-        <w:numPr>
-          <w:ilvl w:val="0"/>
-          <w:numId w:val="13"/>
-        </w:numPr>
-        <w:spacing w:after="60" w:line="276"/>
-      </w:pPr>
-      <w:r>
-        <w:t xml:space="preserve">Click </w:t>
-      </w:r>
-      <w:r>
-        <w:rPr>
-          <w:b/>
-          <w:bCs/>
-        </w:rPr>
-        <w:t xml:space="preserve">Generate bill</w:t>
-      </w:r>
-      <w:r>
-        <w:t xml:space="preserve">. The bill is issued with a due date.</w:t>
+        <w:t xml:space="preserve">Replace faulty equipment; the old item is recorded and the new one is taken from stock.</w:t>
+      </w:r>
+    </w:p>
+    <w:p>
+      <w:pPr>
+        <w:pStyle w:val="Heading1"/>
+        <w:pageBreakBefore/>
+      </w:pPr>
+      <w:r>
+        <w:t xml:space="preserve">7. Accounts Staff Guide</w:t>
       </w:r>
     </w:p>
     <w:p>
@@ -4132,7 +4546,7 @@
           <wp:inline distT="0" distB="0" distL="0" distR="0">
             <wp:extent cx="5715000" cy="3571875"/>
             <wp:effectExtent t="0" r="0" b="0" l="0"/>
-            <wp:docPr id="21" name="ui-accounts-bill.jpg" descr="ui accounts bill jpg" title="ui-accounts-bill.jpg"/>
+            <wp:docPr id="21" name="ui-accounts-dashboard.jpg" descr="ui accounts dashboard jpg" title="ui-accounts-dashboard.jpg"/>
             <wp:cNvGraphicFramePr>
               <a:graphicFrameLocks xmlns:a="http://schemas.openxmlformats.org/drawingml/2006/main" noChangeAspect="1"/>
             </wp:cNvGraphicFramePr>
@@ -4181,7 +4595,7 @@
           <w:sz w:val="18"/>
           <w:szCs w:val="18"/>
         </w:rPr>
-        <w:t xml:space="preserve">Figure 20 - Generating a bill with the charges preview</w:t>
+        <w:t xml:space="preserve">Figure 20 - Accounts dashboard</w:t>
       </w:r>
     </w:p>
     <w:p>
@@ -4189,32 +4603,89 @@
         <w:pStyle w:val="Heading2"/>
       </w:pPr>
       <w:r>
-        <w:t xml:space="preserve">7.2 Bills and payments</w:t>
-      </w:r>
-    </w:p>
-    <w:p>
-      <w:pPr>
-        <w:spacing w:after="120" w:line="288"/>
-      </w:pPr>
+        <w:t xml:space="preserve">7.1 Generating a bill</w:t>
+      </w:r>
+    </w:p>
+    <w:p>
+      <w:pPr>
+        <w:pStyle w:val="ListParagraph"/>
+        <w:numPr>
+          <w:ilvl w:val="0"/>
+          <w:numId w:val="13"/>
+        </w:numPr>
+        <w:spacing w:after="60" w:line="276"/>
+      </w:pPr>
+      <w:r>
+        <w:t xml:space="preserve">Open </w:t>
+      </w:r>
       <w:r>
         <w:rPr>
           <w:b/>
           <w:bCs/>
         </w:rPr>
-        <w:t xml:space="preserve">Bills &amp; payments</w:t>
-      </w:r>
-      <w:r>
-        <w:t xml:space="preserve"> lists every bill with its total, the amount brought forward from earlier unpaid bills, what has been paid and what is outstanding. Use </w:t>
+        <w:t xml:space="preserve">Generate bill</w:t>
+      </w:r>
+      <w:r>
+        <w:t xml:space="preserve"> and choose the connection and the billing period.</w:t>
+      </w:r>
+    </w:p>
+    <w:p>
+      <w:pPr>
+        <w:pStyle w:val="ListParagraph"/>
+        <w:numPr>
+          <w:ilvl w:val="0"/>
+          <w:numId w:val="13"/>
+        </w:numPr>
+        <w:spacing w:after="60" w:line="276"/>
+      </w:pPr>
+      <w:r>
+        <w:t xml:space="preserve">For a landline, enter the local, STD and mobile call minutes and any other usage charge.</w:t>
+      </w:r>
+    </w:p>
+    <w:p>
+      <w:pPr>
+        <w:pStyle w:val="ListParagraph"/>
+        <w:numPr>
+          <w:ilvl w:val="0"/>
+          <w:numId w:val="13"/>
+        </w:numPr>
+        <w:spacing w:after="60" w:line="276"/>
+      </w:pPr>
+      <w:r>
+        <w:t xml:space="preserve">Check the </w:t>
       </w:r>
       <w:r>
         <w:rPr>
           <w:b/>
           <w:bCs/>
         </w:rPr>
-        <w:t xml:space="preserve">Record payment</w:t>
-      </w:r>
-      <w:r>
-        <w:t xml:space="preserve"> to record a payment received at the head office.</w:t>
+        <w:t xml:space="preserve">charges preview</w:t>
+      </w:r>
+      <w:r>
+        <w:t xml:space="preserve">: plan charge, calls, deposit on the first bill, bulk discount and 12.24% tax.</w:t>
+      </w:r>
+    </w:p>
+    <w:p>
+      <w:pPr>
+        <w:pStyle w:val="ListParagraph"/>
+        <w:numPr>
+          <w:ilvl w:val="0"/>
+          <w:numId w:val="13"/>
+        </w:numPr>
+        <w:spacing w:after="60" w:line="276"/>
+      </w:pPr>
+      <w:r>
+        <w:t xml:space="preserve">Click </w:t>
+      </w:r>
+      <w:r>
+        <w:rPr>
+          <w:b/>
+          <w:bCs/>
+        </w:rPr>
+        <w:t xml:space="preserve">Generate bill</w:t>
+      </w:r>
+      <w:r>
+        <w:t xml:space="preserve">. The bill is issued with a due date.</w:t>
       </w:r>
     </w:p>
     <w:p>
@@ -4228,7 +4699,7 @@
           <wp:inline distT="0" distB="0" distL="0" distR="0">
             <wp:extent cx="5715000" cy="3571875"/>
             <wp:effectExtent t="0" r="0" b="0" l="0"/>
-            <wp:docPr id="22" name="ui-accounts-bills.jpg" descr="ui accounts bills jpg" title="ui-accounts-bills.jpg"/>
+            <wp:docPr id="22" name="ui-accounts-bill.jpg" descr="ui accounts bill jpg" title="ui-accounts-bill.jpg"/>
             <wp:cNvGraphicFramePr>
               <a:graphicFrameLocks xmlns:a="http://schemas.openxmlformats.org/drawingml/2006/main" noChangeAspect="1"/>
             </wp:cNvGraphicFramePr>
@@ -4277,16 +4748,15 @@
           <w:sz w:val="18"/>
           <w:szCs w:val="18"/>
         </w:rPr>
-        <w:t xml:space="preserve">Figure 21 - All bills with status badges</w:t>
-      </w:r>
-    </w:p>
-    <w:p>
-      <w:pPr>
-        <w:pStyle w:val="Heading1"/>
-        <w:pageBreakBefore/>
-      </w:pPr>
-      <w:r>
-        <w:t xml:space="preserve">8. Administrator Guide</w:t>
+        <w:t xml:space="preserve">Figure 21 - Generating a bill with the charges preview</w:t>
+      </w:r>
+    </w:p>
+    <w:p>
+      <w:pPr>
+        <w:pStyle w:val="Heading2"/>
+      </w:pPr>
+      <w:r>
+        <w:t xml:space="preserve">7.2 Bills and payments</w:t>
       </w:r>
     </w:p>
     <w:p>
@@ -4294,7 +4764,24 @@
         <w:spacing w:after="120" w:line="288"/>
       </w:pPr>
       <w:r>
-        <w:t xml:space="preserve">The administrator signs in with the account created when the system was installed and should change its password after the first sign-in.</w:t>
+        <w:rPr>
+          <w:b/>
+          <w:bCs/>
+        </w:rPr>
+        <w:t xml:space="preserve">Bills &amp; payments</w:t>
+      </w:r>
+      <w:r>
+        <w:t xml:space="preserve"> lists every bill with its total, the amount brought forward from earlier unpaid bills, what has been paid and what is outstanding. Use </w:t>
+      </w:r>
+      <w:r>
+        <w:rPr>
+          <w:b/>
+          <w:bCs/>
+        </w:rPr>
+        <w:t xml:space="preserve">Record payment</w:t>
+      </w:r>
+      <w:r>
+        <w:t xml:space="preserve"> to record a payment received at the head office.</w:t>
       </w:r>
     </w:p>
     <w:p>
@@ -4308,7 +4795,7 @@
           <wp:inline distT="0" distB="0" distL="0" distR="0">
             <wp:extent cx="5715000" cy="3571875"/>
             <wp:effectExtent t="0" r="0" b="0" l="0"/>
-            <wp:docPr id="23" name="ui-admin-dashboard.jpg" descr="ui admin dashboard jpg" title="ui-admin-dashboard.jpg"/>
+            <wp:docPr id="23" name="ui-accounts-bills.jpg" descr="ui accounts bills jpg" title="ui-accounts-bills.jpg"/>
             <wp:cNvGraphicFramePr>
               <a:graphicFrameLocks xmlns:a="http://schemas.openxmlformats.org/drawingml/2006/main" noChangeAspect="1"/>
             </wp:cNvGraphicFramePr>
@@ -4357,669 +4844,26 @@
           <w:sz w:val="18"/>
           <w:szCs w:val="18"/>
         </w:rPr>
-        <w:t xml:space="preserve">Figure 22 - Admin dashboard</w:t>
-      </w:r>
-    </w:p>
-    <w:p>
-      <w:pPr>
-        <w:pStyle w:val="Heading2"/>
-      </w:pPr>
-      <w:r>
-        <w:t xml:space="preserve">8.1 Master data</w:t>
-      </w:r>
-    </w:p>
-    <w:tbl>
-      <w:tblPr>
-        <w:tblW w:type="dxa" w:w="9638"/>
-        <w:tblBorders>
-          <w:top w:val="single" w:color="auto" w:sz="4"/>
-          <w:left w:val="single" w:color="auto" w:sz="4"/>
-          <w:bottom w:val="single" w:color="auto" w:sz="4"/>
-          <w:right w:val="single" w:color="auto" w:sz="4"/>
-          <w:insideH w:val="single" w:color="auto" w:sz="4"/>
-          <w:insideV w:val="single" w:color="auto" w:sz="4"/>
-        </w:tblBorders>
-      </w:tblPr>
-      <w:tblGrid>
-        <w:gridCol w:w="2400"/>
-        <w:gridCol w:w="7238"/>
-      </w:tblGrid>
-      <w:tr>
-        <w:trPr>
-          <w:tblHeader/>
-        </w:trPr>
-        <w:tc>
-          <w:tcPr>
-            <w:tcW w:type="dxa" w:w="2400"/>
-            <w:tcBorders>
-              <w:top w:val="single" w:color="CBD5E1" w:sz="4"/>
-              <w:left w:val="single" w:color="CBD5E1" w:sz="4"/>
-              <w:bottom w:val="single" w:color="CBD5E1" w:sz="4"/>
-              <w:right w:val="single" w:color="CBD5E1" w:sz="4"/>
-            </w:tcBorders>
-            <w:shd w:fill="0A2540" w:color="auto" w:val="clear"/>
-            <w:tcMar>
-              <w:top w:type="dxa" w:w="80"/>
-              <w:left w:type="dxa" w:w="110"/>
-              <w:bottom w:type="dxa" w:w="80"/>
-              <w:right w:type="dxa" w:w="110"/>
-            </w:tcMar>
-            <w:vAlign w:val="center"/>
-          </w:tcPr>
-          <w:p>
-            <w:r>
-              <w:rPr>
-                <w:b/>
-                <w:bCs/>
-                <w:color w:val="FFFFFF"/>
-                <w:sz w:val="19"/>
-                <w:szCs w:val="19"/>
-              </w:rPr>
-              <w:t xml:space="preserve">Page</w:t>
-            </w:r>
-          </w:p>
-        </w:tc>
-        <w:tc>
-          <w:tcPr>
-            <w:tcW w:type="dxa" w:w="7238"/>
-            <w:tcBorders>
-              <w:top w:val="single" w:color="CBD5E1" w:sz="4"/>
-              <w:left w:val="single" w:color="CBD5E1" w:sz="4"/>
-              <w:bottom w:val="single" w:color="CBD5E1" w:sz="4"/>
-              <w:right w:val="single" w:color="CBD5E1" w:sz="4"/>
-            </w:tcBorders>
-            <w:shd w:fill="0A2540" w:color="auto" w:val="clear"/>
-            <w:tcMar>
-              <w:top w:type="dxa" w:w="80"/>
-              <w:left w:type="dxa" w:w="110"/>
-              <w:bottom w:type="dxa" w:w="80"/>
-              <w:right w:type="dxa" w:w="110"/>
-            </w:tcMar>
-            <w:vAlign w:val="center"/>
-          </w:tcPr>
-          <w:p>
-            <w:r>
-              <w:rPr>
-                <w:b/>
-                <w:bCs/>
-                <w:color w:val="FFFFFF"/>
-                <w:sz w:val="19"/>
-                <w:szCs w:val="19"/>
-              </w:rPr>
-              <w:t xml:space="preserve">What to do there</w:t>
-            </w:r>
-          </w:p>
-        </w:tc>
-      </w:tr>
-      <w:tr>
-        <w:trPr>
-          <w:cantSplit/>
-        </w:trPr>
-        <w:tc>
-          <w:tcPr>
-            <w:tcW w:type="dxa" w:w="2400"/>
-            <w:tcBorders>
-              <w:top w:val="single" w:color="CBD5E1" w:sz="4"/>
-              <w:left w:val="single" w:color="CBD5E1" w:sz="4"/>
-              <w:bottom w:val="single" w:color="CBD5E1" w:sz="4"/>
-              <w:right w:val="single" w:color="CBD5E1" w:sz="4"/>
-            </w:tcBorders>
-            <w:shd w:fill="FFFFFF" w:color="auto" w:val="clear"/>
-            <w:tcMar>
-              <w:top w:type="dxa" w:w="70"/>
-              <w:left w:type="dxa" w:w="110"/>
-              <w:bottom w:type="dxa" w:w="70"/>
-              <w:right w:type="dxa" w:w="110"/>
-            </w:tcMar>
-          </w:tcPr>
-          <w:p>
-            <w:pPr>
-              <w:spacing w:after="0" w:line="264"/>
-            </w:pPr>
-            <w:r>
-              <w:rPr>
-                <w:b w:val="false"/>
-                <w:bCs w:val="false"/>
-                <w:color w:val="0F172A"/>
-                <w:sz w:val="19"/>
-                <w:szCs w:val="19"/>
-              </w:rPr>
-              <w:t xml:space="preserve">Cities</w:t>
-            </w:r>
-          </w:p>
-        </w:tc>
-        <w:tc>
-          <w:tcPr>
-            <w:tcW w:type="dxa" w:w="7238"/>
-            <w:tcBorders>
-              <w:top w:val="single" w:color="CBD5E1" w:sz="4"/>
-              <w:left w:val="single" w:color="CBD5E1" w:sz="4"/>
-              <w:bottom w:val="single" w:color="CBD5E1" w:sz="4"/>
-              <w:right w:val="single" w:color="CBD5E1" w:sz="4"/>
-            </w:tcBorders>
-            <w:shd w:fill="FFFFFF" w:color="auto" w:val="clear"/>
-            <w:tcMar>
-              <w:top w:type="dxa" w:w="70"/>
-              <w:left w:type="dxa" w:w="110"/>
-              <w:bottom w:type="dxa" w:w="70"/>
-              <w:right w:type="dxa" w:w="110"/>
-            </w:tcMar>
-          </w:tcPr>
-          <w:p>
-            <w:pPr>
-              <w:spacing w:after="0" w:line="264"/>
-            </w:pPr>
-            <w:r>
-              <w:rPr>
-                <w:b w:val="false"/>
-                <w:bCs w:val="false"/>
-                <w:color w:val="0F172A"/>
-                <w:sz w:val="19"/>
-                <w:szCs w:val="19"/>
-              </w:rPr>
-              <w:t xml:space="preserve">Add the cities served. Each has a 3-digit code that becomes part of every account ID issued there.</w:t>
-            </w:r>
-          </w:p>
-        </w:tc>
-      </w:tr>
-      <w:tr>
-        <w:trPr>
-          <w:cantSplit/>
-        </w:trPr>
-        <w:tc>
-          <w:tcPr>
-            <w:tcW w:type="dxa" w:w="2400"/>
-            <w:tcBorders>
-              <w:top w:val="single" w:color="CBD5E1" w:sz="4"/>
-              <w:left w:val="single" w:color="CBD5E1" w:sz="4"/>
-              <w:bottom w:val="single" w:color="CBD5E1" w:sz="4"/>
-              <w:right w:val="single" w:color="CBD5E1" w:sz="4"/>
-            </w:tcBorders>
-            <w:shd w:fill="F8FAFC" w:color="auto" w:val="clear"/>
-            <w:tcMar>
-              <w:top w:type="dxa" w:w="70"/>
-              <w:left w:type="dxa" w:w="110"/>
-              <w:bottom w:type="dxa" w:w="70"/>
-              <w:right w:type="dxa" w:w="110"/>
-            </w:tcMar>
-          </w:tcPr>
-          <w:p>
-            <w:pPr>
-              <w:spacing w:after="0" w:line="264"/>
-            </w:pPr>
-            <w:r>
-              <w:rPr>
-                <w:b w:val="false"/>
-                <w:bCs w:val="false"/>
-                <w:color w:val="0F172A"/>
-                <w:sz w:val="19"/>
-                <w:szCs w:val="19"/>
-              </w:rPr>
-              <w:t xml:space="preserve">Retail shops</w:t>
-            </w:r>
-          </w:p>
-        </w:tc>
-        <w:tc>
-          <w:tcPr>
-            <w:tcW w:type="dxa" w:w="7238"/>
-            <w:tcBorders>
-              <w:top w:val="single" w:color="CBD5E1" w:sz="4"/>
-              <w:left w:val="single" w:color="CBD5E1" w:sz="4"/>
-              <w:bottom w:val="single" w:color="CBD5E1" w:sz="4"/>
-              <w:right w:val="single" w:color="CBD5E1" w:sz="4"/>
-            </w:tcBorders>
-            <w:shd w:fill="F8FAFC" w:color="auto" w:val="clear"/>
-            <w:tcMar>
-              <w:top w:type="dxa" w:w="70"/>
-              <w:left w:type="dxa" w:w="110"/>
-              <w:bottom w:type="dxa" w:w="70"/>
-              <w:right w:type="dxa" w:w="110"/>
-            </w:tcMar>
-          </w:tcPr>
-          <w:p>
-            <w:pPr>
-              <w:spacing w:after="0" w:line="264"/>
-            </w:pPr>
-            <w:r>
-              <w:rPr>
-                <w:b w:val="false"/>
-                <w:bCs w:val="false"/>
-                <w:color w:val="0F172A"/>
-                <w:sz w:val="19"/>
-                <w:szCs w:val="19"/>
-              </w:rPr>
-              <w:t xml:space="preserve">Add one shop per city with its address and phone number.</w:t>
-            </w:r>
-          </w:p>
-        </w:tc>
-      </w:tr>
-      <w:tr>
-        <w:trPr>
-          <w:cantSplit/>
-        </w:trPr>
-        <w:tc>
-          <w:tcPr>
-            <w:tcW w:type="dxa" w:w="2400"/>
-            <w:tcBorders>
-              <w:top w:val="single" w:color="CBD5E1" w:sz="4"/>
-              <w:left w:val="single" w:color="CBD5E1" w:sz="4"/>
-              <w:bottom w:val="single" w:color="CBD5E1" w:sz="4"/>
-              <w:right w:val="single" w:color="CBD5E1" w:sz="4"/>
-            </w:tcBorders>
-            <w:shd w:fill="FFFFFF" w:color="auto" w:val="clear"/>
-            <w:tcMar>
-              <w:top w:type="dxa" w:w="70"/>
-              <w:left w:type="dxa" w:w="110"/>
-              <w:bottom w:type="dxa" w:w="70"/>
-              <w:right w:type="dxa" w:w="110"/>
-            </w:tcMar>
-          </w:tcPr>
-          <w:p>
-            <w:pPr>
-              <w:spacing w:after="0" w:line="264"/>
-            </w:pPr>
-            <w:r>
-              <w:rPr>
-                <w:b w:val="false"/>
-                <w:bCs w:val="false"/>
-                <w:color w:val="0F172A"/>
-                <w:sz w:val="19"/>
-                <w:szCs w:val="19"/>
-              </w:rPr>
-              <w:t xml:space="preserve">Employees</w:t>
-            </w:r>
-          </w:p>
-        </w:tc>
-        <w:tc>
-          <w:tcPr>
-            <w:tcW w:type="dxa" w:w="7238"/>
-            <w:tcBorders>
-              <w:top w:val="single" w:color="CBD5E1" w:sz="4"/>
-              <w:left w:val="single" w:color="CBD5E1" w:sz="4"/>
-              <w:bottom w:val="single" w:color="CBD5E1" w:sz="4"/>
-              <w:right w:val="single" w:color="CBD5E1" w:sz="4"/>
-            </w:tcBorders>
-            <w:shd w:fill="FFFFFF" w:color="auto" w:val="clear"/>
-            <w:tcMar>
-              <w:top w:type="dxa" w:w="70"/>
-              <w:left w:type="dxa" w:w="110"/>
-              <w:bottom w:type="dxa" w:w="70"/>
-              <w:right w:type="dxa" w:w="110"/>
-            </w:tcMar>
-          </w:tcPr>
-          <w:p>
-            <w:pPr>
-              <w:spacing w:after="0" w:line="264"/>
-            </w:pPr>
-            <w:r>
-              <w:rPr>
-                <w:b w:val="false"/>
-                <w:bCs w:val="false"/>
-                <w:color w:val="0F172A"/>
-                <w:sz w:val="19"/>
-                <w:szCs w:val="19"/>
-              </w:rPr>
-              <w:t xml:space="preserve">Create staff logins and choose their role (Admin, Accounts, Technical, Retail) and shop.</w:t>
-            </w:r>
-          </w:p>
-        </w:tc>
-      </w:tr>
-      <w:tr>
-        <w:trPr>
-          <w:cantSplit/>
-        </w:trPr>
-        <w:tc>
-          <w:tcPr>
-            <w:tcW w:type="dxa" w:w="2400"/>
-            <w:tcBorders>
-              <w:top w:val="single" w:color="CBD5E1" w:sz="4"/>
-              <w:left w:val="single" w:color="CBD5E1" w:sz="4"/>
-              <w:bottom w:val="single" w:color="CBD5E1" w:sz="4"/>
-              <w:right w:val="single" w:color="CBD5E1" w:sz="4"/>
-            </w:tcBorders>
-            <w:shd w:fill="F8FAFC" w:color="auto" w:val="clear"/>
-            <w:tcMar>
-              <w:top w:type="dxa" w:w="70"/>
-              <w:left w:type="dxa" w:w="110"/>
-              <w:bottom w:type="dxa" w:w="70"/>
-              <w:right w:type="dxa" w:w="110"/>
-            </w:tcMar>
-          </w:tcPr>
-          <w:p>
-            <w:pPr>
-              <w:spacing w:after="0" w:line="264"/>
-            </w:pPr>
-            <w:r>
-              <w:rPr>
-                <w:b w:val="false"/>
-                <w:bCs w:val="false"/>
-                <w:color w:val="0F172A"/>
-                <w:sz w:val="19"/>
-                <w:szCs w:val="19"/>
-              </w:rPr>
-              <w:t xml:space="preserve">Plans</w:t>
-            </w:r>
-          </w:p>
-        </w:tc>
-        <w:tc>
-          <w:tcPr>
-            <w:tcW w:type="dxa" w:w="7238"/>
-            <w:tcBorders>
-              <w:top w:val="single" w:color="CBD5E1" w:sz="4"/>
-              <w:left w:val="single" w:color="CBD5E1" w:sz="4"/>
-              <w:bottom w:val="single" w:color="CBD5E1" w:sz="4"/>
-              <w:right w:val="single" w:color="CBD5E1" w:sz="4"/>
-            </w:tcBorders>
-            <w:shd w:fill="F8FAFC" w:color="auto" w:val="clear"/>
-            <w:tcMar>
-              <w:top w:type="dxa" w:w="70"/>
-              <w:left w:type="dxa" w:w="110"/>
-              <w:bottom w:type="dxa" w:w="70"/>
-              <w:right w:type="dxa" w:w="110"/>
-            </w:tcMar>
-          </w:tcPr>
-          <w:p>
-            <w:pPr>
-              <w:spacing w:after="0" w:line="264"/>
-            </w:pPr>
-            <w:r>
-              <w:rPr>
-                <w:b w:val="false"/>
-                <w:bCs w:val="false"/>
-                <w:color w:val="0F172A"/>
-                <w:sz w:val="19"/>
-                <w:szCs w:val="19"/>
-              </w:rPr>
-              <w:t xml:space="preserve">Add, edit, search and delete Dial-Up, Broadband and Landline plans, prices and deposits.</w:t>
-            </w:r>
-          </w:p>
-        </w:tc>
-      </w:tr>
-      <w:tr>
-        <w:trPr>
-          <w:cantSplit/>
-        </w:trPr>
-        <w:tc>
-          <w:tcPr>
-            <w:tcW w:type="dxa" w:w="2400"/>
-            <w:tcBorders>
-              <w:top w:val="single" w:color="CBD5E1" w:sz="4"/>
-              <w:left w:val="single" w:color="CBD5E1" w:sz="4"/>
-              <w:bottom w:val="single" w:color="CBD5E1" w:sz="4"/>
-              <w:right w:val="single" w:color="CBD5E1" w:sz="4"/>
-            </w:tcBorders>
-            <w:shd w:fill="FFFFFF" w:color="auto" w:val="clear"/>
-            <w:tcMar>
-              <w:top w:type="dxa" w:w="70"/>
-              <w:left w:type="dxa" w:w="110"/>
-              <w:bottom w:type="dxa" w:w="70"/>
-              <w:right w:type="dxa" w:w="110"/>
-            </w:tcMar>
-          </w:tcPr>
-          <w:p>
-            <w:pPr>
-              <w:spacing w:after="0" w:line="264"/>
-            </w:pPr>
-            <w:r>
-              <w:rPr>
-                <w:b w:val="false"/>
-                <w:bCs w:val="false"/>
-                <w:color w:val="0F172A"/>
-                <w:sz w:val="19"/>
-                <w:szCs w:val="19"/>
-              </w:rPr>
-              <w:t xml:space="preserve">Discount schemes</w:t>
-            </w:r>
-          </w:p>
-        </w:tc>
-        <w:tc>
-          <w:tcPr>
-            <w:tcW w:type="dxa" w:w="7238"/>
-            <w:tcBorders>
-              <w:top w:val="single" w:color="CBD5E1" w:sz="4"/>
-              <w:left w:val="single" w:color="CBD5E1" w:sz="4"/>
-              <w:bottom w:val="single" w:color="CBD5E1" w:sz="4"/>
-              <w:right w:val="single" w:color="CBD5E1" w:sz="4"/>
-            </w:tcBorders>
-            <w:shd w:fill="FFFFFF" w:color="auto" w:val="clear"/>
-            <w:tcMar>
-              <w:top w:type="dxa" w:w="70"/>
-              <w:left w:type="dxa" w:w="110"/>
-              <w:bottom w:type="dxa" w:w="70"/>
-              <w:right w:type="dxa" w:w="110"/>
-            </w:tcMar>
-          </w:tcPr>
-          <w:p>
-            <w:pPr>
-              <w:spacing w:after="0" w:line="264"/>
-            </w:pPr>
-            <w:r>
-              <w:rPr>
-                <w:b w:val="false"/>
-                <w:bCs w:val="false"/>
-                <w:color w:val="0F172A"/>
-                <w:sz w:val="19"/>
-                <w:szCs w:val="19"/>
-              </w:rPr>
-              <w:t xml:space="preserve">Set the bulk discount bands (for example 10-14 connections: 25%).</w:t>
-            </w:r>
-          </w:p>
-        </w:tc>
-      </w:tr>
-      <w:tr>
-        <w:trPr>
-          <w:cantSplit/>
-        </w:trPr>
-        <w:tc>
-          <w:tcPr>
-            <w:tcW w:type="dxa" w:w="2400"/>
-            <w:tcBorders>
-              <w:top w:val="single" w:color="CBD5E1" w:sz="4"/>
-              <w:left w:val="single" w:color="CBD5E1" w:sz="4"/>
-              <w:bottom w:val="single" w:color="CBD5E1" w:sz="4"/>
-              <w:right w:val="single" w:color="CBD5E1" w:sz="4"/>
-            </w:tcBorders>
-            <w:shd w:fill="F8FAFC" w:color="auto" w:val="clear"/>
-            <w:tcMar>
-              <w:top w:type="dxa" w:w="70"/>
-              <w:left w:type="dxa" w:w="110"/>
-              <w:bottom w:type="dxa" w:w="70"/>
-              <w:right w:type="dxa" w:w="110"/>
-            </w:tcMar>
-          </w:tcPr>
-          <w:p>
-            <w:pPr>
-              <w:spacing w:after="0" w:line="264"/>
-            </w:pPr>
-            <w:r>
-              <w:rPr>
-                <w:b w:val="false"/>
-                <w:bCs w:val="false"/>
-                <w:color w:val="0F172A"/>
-                <w:sz w:val="19"/>
-                <w:szCs w:val="19"/>
-              </w:rPr>
-              <w:t xml:space="preserve">Vendors</w:t>
-            </w:r>
-          </w:p>
-        </w:tc>
-        <w:tc>
-          <w:tcPr>
-            <w:tcW w:type="dxa" w:w="7238"/>
-            <w:tcBorders>
-              <w:top w:val="single" w:color="CBD5E1" w:sz="4"/>
-              <w:left w:val="single" w:color="CBD5E1" w:sz="4"/>
-              <w:bottom w:val="single" w:color="CBD5E1" w:sz="4"/>
-              <w:right w:val="single" w:color="CBD5E1" w:sz="4"/>
-            </w:tcBorders>
-            <w:shd w:fill="F8FAFC" w:color="auto" w:val="clear"/>
-            <w:tcMar>
-              <w:top w:type="dxa" w:w="70"/>
-              <w:left w:type="dxa" w:w="110"/>
-              <w:bottom w:type="dxa" w:w="70"/>
-              <w:right w:type="dxa" w:w="110"/>
-            </w:tcMar>
-          </w:tcPr>
-          <w:p>
-            <w:pPr>
-              <w:spacing w:after="0" w:line="264"/>
-            </w:pPr>
-            <w:r>
-              <w:rPr>
-                <w:b w:val="false"/>
-                <w:bCs w:val="false"/>
-                <w:color w:val="0F172A"/>
-                <w:sz w:val="19"/>
-                <w:szCs w:val="19"/>
-              </w:rPr>
-              <w:t xml:space="preserve">Equipment manufacturers and suppliers.</w:t>
-            </w:r>
-          </w:p>
-        </w:tc>
-      </w:tr>
-      <w:tr>
-        <w:trPr>
-          <w:cantSplit/>
-        </w:trPr>
-        <w:tc>
-          <w:tcPr>
-            <w:tcW w:type="dxa" w:w="2400"/>
-            <w:tcBorders>
-              <w:top w:val="single" w:color="CBD5E1" w:sz="4"/>
-              <w:left w:val="single" w:color="CBD5E1" w:sz="4"/>
-              <w:bottom w:val="single" w:color="CBD5E1" w:sz="4"/>
-              <w:right w:val="single" w:color="CBD5E1" w:sz="4"/>
-            </w:tcBorders>
-            <w:shd w:fill="FFFFFF" w:color="auto" w:val="clear"/>
-            <w:tcMar>
-              <w:top w:type="dxa" w:w="70"/>
-              <w:left w:type="dxa" w:w="110"/>
-              <w:bottom w:type="dxa" w:w="70"/>
-              <w:right w:type="dxa" w:w="110"/>
-            </w:tcMar>
-          </w:tcPr>
-          <w:p>
-            <w:pPr>
-              <w:spacing w:after="0" w:line="264"/>
-            </w:pPr>
-            <w:r>
-              <w:rPr>
-                <w:b w:val="false"/>
-                <w:bCs w:val="false"/>
-                <w:color w:val="0F172A"/>
-                <w:sz w:val="19"/>
-                <w:szCs w:val="19"/>
-              </w:rPr>
-              <w:t xml:space="preserve">Products &amp; stock</w:t>
-            </w:r>
-          </w:p>
-        </w:tc>
-        <w:tc>
-          <w:tcPr>
-            <w:tcW w:type="dxa" w:w="7238"/>
-            <w:tcBorders>
-              <w:top w:val="single" w:color="CBD5E1" w:sz="4"/>
-              <w:left w:val="single" w:color="CBD5E1" w:sz="4"/>
-              <w:bottom w:val="single" w:color="CBD5E1" w:sz="4"/>
-              <w:right w:val="single" w:color="CBD5E1" w:sz="4"/>
-            </w:tcBorders>
-            <w:shd w:fill="FFFFFF" w:color="auto" w:val="clear"/>
-            <w:tcMar>
-              <w:top w:type="dxa" w:w="70"/>
-              <w:left w:type="dxa" w:w="110"/>
-              <w:bottom w:type="dxa" w:w="70"/>
-              <w:right w:type="dxa" w:w="110"/>
-            </w:tcMar>
-          </w:tcPr>
-          <w:p>
-            <w:pPr>
-              <w:spacing w:after="0" w:line="264"/>
-            </w:pPr>
-            <w:r>
-              <w:rPr>
-                <w:b w:val="false"/>
-                <w:bCs w:val="false"/>
-                <w:color w:val="0F172A"/>
-                <w:sz w:val="19"/>
-                <w:szCs w:val="19"/>
-              </w:rPr>
-              <w:t xml:space="preserve">Modems, routers and other equipment with stock and reorder level.</w:t>
-            </w:r>
-          </w:p>
-        </w:tc>
-      </w:tr>
-      <w:tr>
-        <w:trPr>
-          <w:cantSplit/>
-        </w:trPr>
-        <w:tc>
-          <w:tcPr>
-            <w:tcW w:type="dxa" w:w="2400"/>
-            <w:tcBorders>
-              <w:top w:val="single" w:color="CBD5E1" w:sz="4"/>
-              <w:left w:val="single" w:color="CBD5E1" w:sz="4"/>
-              <w:bottom w:val="single" w:color="CBD5E1" w:sz="4"/>
-              <w:right w:val="single" w:color="CBD5E1" w:sz="4"/>
-            </w:tcBorders>
-            <w:shd w:fill="F8FAFC" w:color="auto" w:val="clear"/>
-            <w:tcMar>
-              <w:top w:type="dxa" w:w="70"/>
-              <w:left w:type="dxa" w:w="110"/>
-              <w:bottom w:type="dxa" w:w="70"/>
-              <w:right w:type="dxa" w:w="110"/>
-            </w:tcMar>
-          </w:tcPr>
-          <w:p>
-            <w:pPr>
-              <w:spacing w:after="0" w:line="264"/>
-            </w:pPr>
-            <w:r>
-              <w:rPr>
-                <w:b w:val="false"/>
-                <w:bCs w:val="false"/>
-                <w:color w:val="0F172A"/>
-                <w:sz w:val="19"/>
-                <w:szCs w:val="19"/>
-              </w:rPr>
-              <w:t xml:space="preserve">Equipment purchases</w:t>
-            </w:r>
-          </w:p>
-        </w:tc>
-        <w:tc>
-          <w:tcPr>
-            <w:tcW w:type="dxa" w:w="7238"/>
-            <w:tcBorders>
-              <w:top w:val="single" w:color="CBD5E1" w:sz="4"/>
-              <w:left w:val="single" w:color="CBD5E1" w:sz="4"/>
-              <w:bottom w:val="single" w:color="CBD5E1" w:sz="4"/>
-              <w:right w:val="single" w:color="CBD5E1" w:sz="4"/>
-            </w:tcBorders>
-            <w:shd w:fill="F8FAFC" w:color="auto" w:val="clear"/>
-            <w:tcMar>
-              <w:top w:type="dxa" w:w="70"/>
-              <w:left w:type="dxa" w:w="110"/>
-              <w:bottom w:type="dxa" w:w="70"/>
-              <w:right w:type="dxa" w:w="110"/>
-            </w:tcMar>
-          </w:tcPr>
-          <w:p>
-            <w:pPr>
-              <w:spacing w:after="0" w:line="264"/>
-            </w:pPr>
-            <w:r>
-              <w:rPr>
-                <w:b w:val="false"/>
-                <w:bCs w:val="false"/>
-                <w:color w:val="0F172A"/>
-                <w:sz w:val="19"/>
-                <w:szCs w:val="19"/>
-              </w:rPr>
-              <w:t xml:space="preserve">Record purchases from vendors; receiving them adds to stock.</w:t>
-            </w:r>
-          </w:p>
-        </w:tc>
-      </w:tr>
-    </w:tbl>
+        <w:t xml:space="preserve">Figure 22 - All bills with status badges</w:t>
+      </w:r>
+    </w:p>
+    <w:p>
+      <w:pPr>
+        <w:pStyle w:val="Heading1"/>
+        <w:pageBreakBefore/>
+      </w:pPr>
+      <w:r>
+        <w:t xml:space="preserve">8. Administrator Guide</w:t>
+      </w:r>
+    </w:p>
+    <w:p>
+      <w:pPr>
+        <w:spacing w:after="120" w:line="288"/>
+      </w:pPr>
+      <w:r>
+        <w:t xml:space="preserve">The administrator signs in with the account created when the system was installed and should change its password after the first sign-in.</w:t>
+      </w:r>
+    </w:p>
     <w:p>
       <w:pPr>
         <w:keepNext/>
@@ -5031,7 +4875,7 @@
           <wp:inline distT="0" distB="0" distL="0" distR="0">
             <wp:extent cx="5715000" cy="3571875"/>
             <wp:effectExtent t="0" r="0" b="0" l="0"/>
-            <wp:docPr id="24" name="ug-admin-plans.jpg" descr="ug admin plans jpg" title="ug-admin-plans.jpg"/>
+            <wp:docPr id="24" name="ui-admin-dashboard.jpg" descr="ui admin dashboard jpg" title="ui-admin-dashboard.jpg"/>
             <wp:cNvGraphicFramePr>
               <a:graphicFrameLocks xmlns:a="http://schemas.openxmlformats.org/drawingml/2006/main" noChangeAspect="1"/>
             </wp:cNvGraphicFramePr>
@@ -5080,9 +4924,669 @@
           <w:sz w:val="18"/>
           <w:szCs w:val="18"/>
         </w:rPr>
-        <w:t xml:space="preserve">Figure 23 - Managing plans</w:t>
-      </w:r>
-    </w:p>
+        <w:t xml:space="preserve">Figure 23 - Admin dashboard</w:t>
+      </w:r>
+    </w:p>
+    <w:p>
+      <w:pPr>
+        <w:pStyle w:val="Heading2"/>
+      </w:pPr>
+      <w:r>
+        <w:t xml:space="preserve">8.1 Master data</w:t>
+      </w:r>
+    </w:p>
+    <w:tbl>
+      <w:tblPr>
+        <w:tblW w:type="dxa" w:w="9638"/>
+        <w:tblBorders>
+          <w:top w:val="single" w:color="auto" w:sz="4"/>
+          <w:left w:val="single" w:color="auto" w:sz="4"/>
+          <w:bottom w:val="single" w:color="auto" w:sz="4"/>
+          <w:right w:val="single" w:color="auto" w:sz="4"/>
+          <w:insideH w:val="single" w:color="auto" w:sz="4"/>
+          <w:insideV w:val="single" w:color="auto" w:sz="4"/>
+        </w:tblBorders>
+      </w:tblPr>
+      <w:tblGrid>
+        <w:gridCol w:w="2400"/>
+        <w:gridCol w:w="7238"/>
+      </w:tblGrid>
+      <w:tr>
+        <w:trPr>
+          <w:tblHeader/>
+        </w:trPr>
+        <w:tc>
+          <w:tcPr>
+            <w:tcW w:type="dxa" w:w="2400"/>
+            <w:tcBorders>
+              <w:top w:val="single" w:color="CBD5E1" w:sz="4"/>
+              <w:left w:val="single" w:color="CBD5E1" w:sz="4"/>
+              <w:bottom w:val="single" w:color="CBD5E1" w:sz="4"/>
+              <w:right w:val="single" w:color="CBD5E1" w:sz="4"/>
+            </w:tcBorders>
+            <w:shd w:fill="0A2540" w:color="auto" w:val="clear"/>
+            <w:tcMar>
+              <w:top w:type="dxa" w:w="80"/>
+              <w:left w:type="dxa" w:w="110"/>
+              <w:bottom w:type="dxa" w:w="80"/>
+              <w:right w:type="dxa" w:w="110"/>
+            </w:tcMar>
+            <w:vAlign w:val="center"/>
+          </w:tcPr>
+          <w:p>
+            <w:r>
+              <w:rPr>
+                <w:b/>
+                <w:bCs/>
+                <w:color w:val="FFFFFF"/>
+                <w:sz w:val="19"/>
+                <w:szCs w:val="19"/>
+              </w:rPr>
+              <w:t xml:space="preserve">Page</w:t>
+            </w:r>
+          </w:p>
+        </w:tc>
+        <w:tc>
+          <w:tcPr>
+            <w:tcW w:type="dxa" w:w="7238"/>
+            <w:tcBorders>
+              <w:top w:val="single" w:color="CBD5E1" w:sz="4"/>
+              <w:left w:val="single" w:color="CBD5E1" w:sz="4"/>
+              <w:bottom w:val="single" w:color="CBD5E1" w:sz="4"/>
+              <w:right w:val="single" w:color="CBD5E1" w:sz="4"/>
+            </w:tcBorders>
+            <w:shd w:fill="0A2540" w:color="auto" w:val="clear"/>
+            <w:tcMar>
+              <w:top w:type="dxa" w:w="80"/>
+              <w:left w:type="dxa" w:w="110"/>
+              <w:bottom w:type="dxa" w:w="80"/>
+              <w:right w:type="dxa" w:w="110"/>
+            </w:tcMar>
+            <w:vAlign w:val="center"/>
+          </w:tcPr>
+          <w:p>
+            <w:r>
+              <w:rPr>
+                <w:b/>
+                <w:bCs/>
+                <w:color w:val="FFFFFF"/>
+                <w:sz w:val="19"/>
+                <w:szCs w:val="19"/>
+              </w:rPr>
+              <w:t xml:space="preserve">What to do there</w:t>
+            </w:r>
+          </w:p>
+        </w:tc>
+      </w:tr>
+      <w:tr>
+        <w:trPr>
+          <w:cantSplit/>
+        </w:trPr>
+        <w:tc>
+          <w:tcPr>
+            <w:tcW w:type="dxa" w:w="2400"/>
+            <w:tcBorders>
+              <w:top w:val="single" w:color="CBD5E1" w:sz="4"/>
+              <w:left w:val="single" w:color="CBD5E1" w:sz="4"/>
+              <w:bottom w:val="single" w:color="CBD5E1" w:sz="4"/>
+              <w:right w:val="single" w:color="CBD5E1" w:sz="4"/>
+            </w:tcBorders>
+            <w:shd w:fill="FFFFFF" w:color="auto" w:val="clear"/>
+            <w:tcMar>
+              <w:top w:type="dxa" w:w="70"/>
+              <w:left w:type="dxa" w:w="110"/>
+              <w:bottom w:type="dxa" w:w="70"/>
+              <w:right w:type="dxa" w:w="110"/>
+            </w:tcMar>
+          </w:tcPr>
+          <w:p>
+            <w:pPr>
+              <w:spacing w:after="0" w:line="264"/>
+            </w:pPr>
+            <w:r>
+              <w:rPr>
+                <w:b w:val="false"/>
+                <w:bCs w:val="false"/>
+                <w:color w:val="0F172A"/>
+                <w:sz w:val="19"/>
+                <w:szCs w:val="19"/>
+              </w:rPr>
+              <w:t xml:space="preserve">Cities</w:t>
+            </w:r>
+          </w:p>
+        </w:tc>
+        <w:tc>
+          <w:tcPr>
+            <w:tcW w:type="dxa" w:w="7238"/>
+            <w:tcBorders>
+              <w:top w:val="single" w:color="CBD5E1" w:sz="4"/>
+              <w:left w:val="single" w:color="CBD5E1" w:sz="4"/>
+              <w:bottom w:val="single" w:color="CBD5E1" w:sz="4"/>
+              <w:right w:val="single" w:color="CBD5E1" w:sz="4"/>
+            </w:tcBorders>
+            <w:shd w:fill="FFFFFF" w:color="auto" w:val="clear"/>
+            <w:tcMar>
+              <w:top w:type="dxa" w:w="70"/>
+              <w:left w:type="dxa" w:w="110"/>
+              <w:bottom w:type="dxa" w:w="70"/>
+              <w:right w:type="dxa" w:w="110"/>
+            </w:tcMar>
+          </w:tcPr>
+          <w:p>
+            <w:pPr>
+              <w:spacing w:after="0" w:line="264"/>
+            </w:pPr>
+            <w:r>
+              <w:rPr>
+                <w:b w:val="false"/>
+                <w:bCs w:val="false"/>
+                <w:color w:val="0F172A"/>
+                <w:sz w:val="19"/>
+                <w:szCs w:val="19"/>
+              </w:rPr>
+              <w:t xml:space="preserve">Add the cities served. Each has a 3-digit code that becomes part of every account ID issued there.</w:t>
+            </w:r>
+          </w:p>
+        </w:tc>
+      </w:tr>
+      <w:tr>
+        <w:trPr>
+          <w:cantSplit/>
+        </w:trPr>
+        <w:tc>
+          <w:tcPr>
+            <w:tcW w:type="dxa" w:w="2400"/>
+            <w:tcBorders>
+              <w:top w:val="single" w:color="CBD5E1" w:sz="4"/>
+              <w:left w:val="single" w:color="CBD5E1" w:sz="4"/>
+              <w:bottom w:val="single" w:color="CBD5E1" w:sz="4"/>
+              <w:right w:val="single" w:color="CBD5E1" w:sz="4"/>
+            </w:tcBorders>
+            <w:shd w:fill="F8FAFC" w:color="auto" w:val="clear"/>
+            <w:tcMar>
+              <w:top w:type="dxa" w:w="70"/>
+              <w:left w:type="dxa" w:w="110"/>
+              <w:bottom w:type="dxa" w:w="70"/>
+              <w:right w:type="dxa" w:w="110"/>
+            </w:tcMar>
+          </w:tcPr>
+          <w:p>
+            <w:pPr>
+              <w:spacing w:after="0" w:line="264"/>
+            </w:pPr>
+            <w:r>
+              <w:rPr>
+                <w:b w:val="false"/>
+                <w:bCs w:val="false"/>
+                <w:color w:val="0F172A"/>
+                <w:sz w:val="19"/>
+                <w:szCs w:val="19"/>
+              </w:rPr>
+              <w:t xml:space="preserve">Retail shops</w:t>
+            </w:r>
+          </w:p>
+        </w:tc>
+        <w:tc>
+          <w:tcPr>
+            <w:tcW w:type="dxa" w:w="7238"/>
+            <w:tcBorders>
+              <w:top w:val="single" w:color="CBD5E1" w:sz="4"/>
+              <w:left w:val="single" w:color="CBD5E1" w:sz="4"/>
+              <w:bottom w:val="single" w:color="CBD5E1" w:sz="4"/>
+              <w:right w:val="single" w:color="CBD5E1" w:sz="4"/>
+            </w:tcBorders>
+            <w:shd w:fill="F8FAFC" w:color="auto" w:val="clear"/>
+            <w:tcMar>
+              <w:top w:type="dxa" w:w="70"/>
+              <w:left w:type="dxa" w:w="110"/>
+              <w:bottom w:type="dxa" w:w="70"/>
+              <w:right w:type="dxa" w:w="110"/>
+            </w:tcMar>
+          </w:tcPr>
+          <w:p>
+            <w:pPr>
+              <w:spacing w:after="0" w:line="264"/>
+            </w:pPr>
+            <w:r>
+              <w:rPr>
+                <w:b w:val="false"/>
+                <w:bCs w:val="false"/>
+                <w:color w:val="0F172A"/>
+                <w:sz w:val="19"/>
+                <w:szCs w:val="19"/>
+              </w:rPr>
+              <w:t xml:space="preserve">Add one shop per city with its address and phone number.</w:t>
+            </w:r>
+          </w:p>
+        </w:tc>
+      </w:tr>
+      <w:tr>
+        <w:trPr>
+          <w:cantSplit/>
+        </w:trPr>
+        <w:tc>
+          <w:tcPr>
+            <w:tcW w:type="dxa" w:w="2400"/>
+            <w:tcBorders>
+              <w:top w:val="single" w:color="CBD5E1" w:sz="4"/>
+              <w:left w:val="single" w:color="CBD5E1" w:sz="4"/>
+              <w:bottom w:val="single" w:color="CBD5E1" w:sz="4"/>
+              <w:right w:val="single" w:color="CBD5E1" w:sz="4"/>
+            </w:tcBorders>
+            <w:shd w:fill="FFFFFF" w:color="auto" w:val="clear"/>
+            <w:tcMar>
+              <w:top w:type="dxa" w:w="70"/>
+              <w:left w:type="dxa" w:w="110"/>
+              <w:bottom w:type="dxa" w:w="70"/>
+              <w:right w:type="dxa" w:w="110"/>
+            </w:tcMar>
+          </w:tcPr>
+          <w:p>
+            <w:pPr>
+              <w:spacing w:after="0" w:line="264"/>
+            </w:pPr>
+            <w:r>
+              <w:rPr>
+                <w:b w:val="false"/>
+                <w:bCs w:val="false"/>
+                <w:color w:val="0F172A"/>
+                <w:sz w:val="19"/>
+                <w:szCs w:val="19"/>
+              </w:rPr>
+              <w:t xml:space="preserve">Employees</w:t>
+            </w:r>
+          </w:p>
+        </w:tc>
+        <w:tc>
+          <w:tcPr>
+            <w:tcW w:type="dxa" w:w="7238"/>
+            <w:tcBorders>
+              <w:top w:val="single" w:color="CBD5E1" w:sz="4"/>
+              <w:left w:val="single" w:color="CBD5E1" w:sz="4"/>
+              <w:bottom w:val="single" w:color="CBD5E1" w:sz="4"/>
+              <w:right w:val="single" w:color="CBD5E1" w:sz="4"/>
+            </w:tcBorders>
+            <w:shd w:fill="FFFFFF" w:color="auto" w:val="clear"/>
+            <w:tcMar>
+              <w:top w:type="dxa" w:w="70"/>
+              <w:left w:type="dxa" w:w="110"/>
+              <w:bottom w:type="dxa" w:w="70"/>
+              <w:right w:type="dxa" w:w="110"/>
+            </w:tcMar>
+          </w:tcPr>
+          <w:p>
+            <w:pPr>
+              <w:spacing w:after="0" w:line="264"/>
+            </w:pPr>
+            <w:r>
+              <w:rPr>
+                <w:b w:val="false"/>
+                <w:bCs w:val="false"/>
+                <w:color w:val="0F172A"/>
+                <w:sz w:val="19"/>
+                <w:szCs w:val="19"/>
+              </w:rPr>
+              <w:t xml:space="preserve">Create staff logins and choose their role (Admin, Accounts, Technical, Retail) and shop.</w:t>
+            </w:r>
+          </w:p>
+        </w:tc>
+      </w:tr>
+      <w:tr>
+        <w:trPr>
+          <w:cantSplit/>
+        </w:trPr>
+        <w:tc>
+          <w:tcPr>
+            <w:tcW w:type="dxa" w:w="2400"/>
+            <w:tcBorders>
+              <w:top w:val="single" w:color="CBD5E1" w:sz="4"/>
+              <w:left w:val="single" w:color="CBD5E1" w:sz="4"/>
+              <w:bottom w:val="single" w:color="CBD5E1" w:sz="4"/>
+              <w:right w:val="single" w:color="CBD5E1" w:sz="4"/>
+            </w:tcBorders>
+            <w:shd w:fill="F8FAFC" w:color="auto" w:val="clear"/>
+            <w:tcMar>
+              <w:top w:type="dxa" w:w="70"/>
+              <w:left w:type="dxa" w:w="110"/>
+              <w:bottom w:type="dxa" w:w="70"/>
+              <w:right w:type="dxa" w:w="110"/>
+            </w:tcMar>
+          </w:tcPr>
+          <w:p>
+            <w:pPr>
+              <w:spacing w:after="0" w:line="264"/>
+            </w:pPr>
+            <w:r>
+              <w:rPr>
+                <w:b w:val="false"/>
+                <w:bCs w:val="false"/>
+                <w:color w:val="0F172A"/>
+                <w:sz w:val="19"/>
+                <w:szCs w:val="19"/>
+              </w:rPr>
+              <w:t xml:space="preserve">Plans</w:t>
+            </w:r>
+          </w:p>
+        </w:tc>
+        <w:tc>
+          <w:tcPr>
+            <w:tcW w:type="dxa" w:w="7238"/>
+            <w:tcBorders>
+              <w:top w:val="single" w:color="CBD5E1" w:sz="4"/>
+              <w:left w:val="single" w:color="CBD5E1" w:sz="4"/>
+              <w:bottom w:val="single" w:color="CBD5E1" w:sz="4"/>
+              <w:right w:val="single" w:color="CBD5E1" w:sz="4"/>
+            </w:tcBorders>
+            <w:shd w:fill="F8FAFC" w:color="auto" w:val="clear"/>
+            <w:tcMar>
+              <w:top w:type="dxa" w:w="70"/>
+              <w:left w:type="dxa" w:w="110"/>
+              <w:bottom w:type="dxa" w:w="70"/>
+              <w:right w:type="dxa" w:w="110"/>
+            </w:tcMar>
+          </w:tcPr>
+          <w:p>
+            <w:pPr>
+              <w:spacing w:after="0" w:line="264"/>
+            </w:pPr>
+            <w:r>
+              <w:rPr>
+                <w:b w:val="false"/>
+                <w:bCs w:val="false"/>
+                <w:color w:val="0F172A"/>
+                <w:sz w:val="19"/>
+                <w:szCs w:val="19"/>
+              </w:rPr>
+              <w:t xml:space="preserve">Add, edit, search and delete Dial-Up, Broadband and Landline plans, prices and deposits.</w:t>
+            </w:r>
+          </w:p>
+        </w:tc>
+      </w:tr>
+      <w:tr>
+        <w:trPr>
+          <w:cantSplit/>
+        </w:trPr>
+        <w:tc>
+          <w:tcPr>
+            <w:tcW w:type="dxa" w:w="2400"/>
+            <w:tcBorders>
+              <w:top w:val="single" w:color="CBD5E1" w:sz="4"/>
+              <w:left w:val="single" w:color="CBD5E1" w:sz="4"/>
+              <w:bottom w:val="single" w:color="CBD5E1" w:sz="4"/>
+              <w:right w:val="single" w:color="CBD5E1" w:sz="4"/>
+            </w:tcBorders>
+            <w:shd w:fill="FFFFFF" w:color="auto" w:val="clear"/>
+            <w:tcMar>
+              <w:top w:type="dxa" w:w="70"/>
+              <w:left w:type="dxa" w:w="110"/>
+              <w:bottom w:type="dxa" w:w="70"/>
+              <w:right w:type="dxa" w:w="110"/>
+            </w:tcMar>
+          </w:tcPr>
+          <w:p>
+            <w:pPr>
+              <w:spacing w:after="0" w:line="264"/>
+            </w:pPr>
+            <w:r>
+              <w:rPr>
+                <w:b w:val="false"/>
+                <w:bCs w:val="false"/>
+                <w:color w:val="0F172A"/>
+                <w:sz w:val="19"/>
+                <w:szCs w:val="19"/>
+              </w:rPr>
+              <w:t xml:space="preserve">Discount schemes</w:t>
+            </w:r>
+          </w:p>
+        </w:tc>
+        <w:tc>
+          <w:tcPr>
+            <w:tcW w:type="dxa" w:w="7238"/>
+            <w:tcBorders>
+              <w:top w:val="single" w:color="CBD5E1" w:sz="4"/>
+              <w:left w:val="single" w:color="CBD5E1" w:sz="4"/>
+              <w:bottom w:val="single" w:color="CBD5E1" w:sz="4"/>
+              <w:right w:val="single" w:color="CBD5E1" w:sz="4"/>
+            </w:tcBorders>
+            <w:shd w:fill="FFFFFF" w:color="auto" w:val="clear"/>
+            <w:tcMar>
+              <w:top w:type="dxa" w:w="70"/>
+              <w:left w:type="dxa" w:w="110"/>
+              <w:bottom w:type="dxa" w:w="70"/>
+              <w:right w:type="dxa" w:w="110"/>
+            </w:tcMar>
+          </w:tcPr>
+          <w:p>
+            <w:pPr>
+              <w:spacing w:after="0" w:line="264"/>
+            </w:pPr>
+            <w:r>
+              <w:rPr>
+                <w:b w:val="false"/>
+                <w:bCs w:val="false"/>
+                <w:color w:val="0F172A"/>
+                <w:sz w:val="19"/>
+                <w:szCs w:val="19"/>
+              </w:rPr>
+              <w:t xml:space="preserve">Set the bulk discount bands (for example 10-14 connections: 25%).</w:t>
+            </w:r>
+          </w:p>
+        </w:tc>
+      </w:tr>
+      <w:tr>
+        <w:trPr>
+          <w:cantSplit/>
+        </w:trPr>
+        <w:tc>
+          <w:tcPr>
+            <w:tcW w:type="dxa" w:w="2400"/>
+            <w:tcBorders>
+              <w:top w:val="single" w:color="CBD5E1" w:sz="4"/>
+              <w:left w:val="single" w:color="CBD5E1" w:sz="4"/>
+              <w:bottom w:val="single" w:color="CBD5E1" w:sz="4"/>
+              <w:right w:val="single" w:color="CBD5E1" w:sz="4"/>
+            </w:tcBorders>
+            <w:shd w:fill="F8FAFC" w:color="auto" w:val="clear"/>
+            <w:tcMar>
+              <w:top w:type="dxa" w:w="70"/>
+              <w:left w:type="dxa" w:w="110"/>
+              <w:bottom w:type="dxa" w:w="70"/>
+              <w:right w:type="dxa" w:w="110"/>
+            </w:tcMar>
+          </w:tcPr>
+          <w:p>
+            <w:pPr>
+              <w:spacing w:after="0" w:line="264"/>
+            </w:pPr>
+            <w:r>
+              <w:rPr>
+                <w:b w:val="false"/>
+                <w:bCs w:val="false"/>
+                <w:color w:val="0F172A"/>
+                <w:sz w:val="19"/>
+                <w:szCs w:val="19"/>
+              </w:rPr>
+              <w:t xml:space="preserve">Vendors</w:t>
+            </w:r>
+          </w:p>
+        </w:tc>
+        <w:tc>
+          <w:tcPr>
+            <w:tcW w:type="dxa" w:w="7238"/>
+            <w:tcBorders>
+              <w:top w:val="single" w:color="CBD5E1" w:sz="4"/>
+              <w:left w:val="single" w:color="CBD5E1" w:sz="4"/>
+              <w:bottom w:val="single" w:color="CBD5E1" w:sz="4"/>
+              <w:right w:val="single" w:color="CBD5E1" w:sz="4"/>
+            </w:tcBorders>
+            <w:shd w:fill="F8FAFC" w:color="auto" w:val="clear"/>
+            <w:tcMar>
+              <w:top w:type="dxa" w:w="70"/>
+              <w:left w:type="dxa" w:w="110"/>
+              <w:bottom w:type="dxa" w:w="70"/>
+              <w:right w:type="dxa" w:w="110"/>
+            </w:tcMar>
+          </w:tcPr>
+          <w:p>
+            <w:pPr>
+              <w:spacing w:after="0" w:line="264"/>
+            </w:pPr>
+            <w:r>
+              <w:rPr>
+                <w:b w:val="false"/>
+                <w:bCs w:val="false"/>
+                <w:color w:val="0F172A"/>
+                <w:sz w:val="19"/>
+                <w:szCs w:val="19"/>
+              </w:rPr>
+              <w:t xml:space="preserve">Equipment manufacturers and suppliers.</w:t>
+            </w:r>
+          </w:p>
+        </w:tc>
+      </w:tr>
+      <w:tr>
+        <w:trPr>
+          <w:cantSplit/>
+        </w:trPr>
+        <w:tc>
+          <w:tcPr>
+            <w:tcW w:type="dxa" w:w="2400"/>
+            <w:tcBorders>
+              <w:top w:val="single" w:color="CBD5E1" w:sz="4"/>
+              <w:left w:val="single" w:color="CBD5E1" w:sz="4"/>
+              <w:bottom w:val="single" w:color="CBD5E1" w:sz="4"/>
+              <w:right w:val="single" w:color="CBD5E1" w:sz="4"/>
+            </w:tcBorders>
+            <w:shd w:fill="FFFFFF" w:color="auto" w:val="clear"/>
+            <w:tcMar>
+              <w:top w:type="dxa" w:w="70"/>
+              <w:left w:type="dxa" w:w="110"/>
+              <w:bottom w:type="dxa" w:w="70"/>
+              <w:right w:type="dxa" w:w="110"/>
+            </w:tcMar>
+          </w:tcPr>
+          <w:p>
+            <w:pPr>
+              <w:spacing w:after="0" w:line="264"/>
+            </w:pPr>
+            <w:r>
+              <w:rPr>
+                <w:b w:val="false"/>
+                <w:bCs w:val="false"/>
+                <w:color w:val="0F172A"/>
+                <w:sz w:val="19"/>
+                <w:szCs w:val="19"/>
+              </w:rPr>
+              <w:t xml:space="preserve">Products &amp; stock</w:t>
+            </w:r>
+          </w:p>
+        </w:tc>
+        <w:tc>
+          <w:tcPr>
+            <w:tcW w:type="dxa" w:w="7238"/>
+            <w:tcBorders>
+              <w:top w:val="single" w:color="CBD5E1" w:sz="4"/>
+              <w:left w:val="single" w:color="CBD5E1" w:sz="4"/>
+              <w:bottom w:val="single" w:color="CBD5E1" w:sz="4"/>
+              <w:right w:val="single" w:color="CBD5E1" w:sz="4"/>
+            </w:tcBorders>
+            <w:shd w:fill="FFFFFF" w:color="auto" w:val="clear"/>
+            <w:tcMar>
+              <w:top w:type="dxa" w:w="70"/>
+              <w:left w:type="dxa" w:w="110"/>
+              <w:bottom w:type="dxa" w:w="70"/>
+              <w:right w:type="dxa" w:w="110"/>
+            </w:tcMar>
+          </w:tcPr>
+          <w:p>
+            <w:pPr>
+              <w:spacing w:after="0" w:line="264"/>
+            </w:pPr>
+            <w:r>
+              <w:rPr>
+                <w:b w:val="false"/>
+                <w:bCs w:val="false"/>
+                <w:color w:val="0F172A"/>
+                <w:sz w:val="19"/>
+                <w:szCs w:val="19"/>
+              </w:rPr>
+              <w:t xml:space="preserve">Modems, routers and other equipment with stock and reorder level.</w:t>
+            </w:r>
+          </w:p>
+        </w:tc>
+      </w:tr>
+      <w:tr>
+        <w:trPr>
+          <w:cantSplit/>
+        </w:trPr>
+        <w:tc>
+          <w:tcPr>
+            <w:tcW w:type="dxa" w:w="2400"/>
+            <w:tcBorders>
+              <w:top w:val="single" w:color="CBD5E1" w:sz="4"/>
+              <w:left w:val="single" w:color="CBD5E1" w:sz="4"/>
+              <w:bottom w:val="single" w:color="CBD5E1" w:sz="4"/>
+              <w:right w:val="single" w:color="CBD5E1" w:sz="4"/>
+            </w:tcBorders>
+            <w:shd w:fill="F8FAFC" w:color="auto" w:val="clear"/>
+            <w:tcMar>
+              <w:top w:type="dxa" w:w="70"/>
+              <w:left w:type="dxa" w:w="110"/>
+              <w:bottom w:type="dxa" w:w="70"/>
+              <w:right w:type="dxa" w:w="110"/>
+            </w:tcMar>
+          </w:tcPr>
+          <w:p>
+            <w:pPr>
+              <w:spacing w:after="0" w:line="264"/>
+            </w:pPr>
+            <w:r>
+              <w:rPr>
+                <w:b w:val="false"/>
+                <w:bCs w:val="false"/>
+                <w:color w:val="0F172A"/>
+                <w:sz w:val="19"/>
+                <w:szCs w:val="19"/>
+              </w:rPr>
+              <w:t xml:space="preserve">Equipment purchases</w:t>
+            </w:r>
+          </w:p>
+        </w:tc>
+        <w:tc>
+          <w:tcPr>
+            <w:tcW w:type="dxa" w:w="7238"/>
+            <w:tcBorders>
+              <w:top w:val="single" w:color="CBD5E1" w:sz="4"/>
+              <w:left w:val="single" w:color="CBD5E1" w:sz="4"/>
+              <w:bottom w:val="single" w:color="CBD5E1" w:sz="4"/>
+              <w:right w:val="single" w:color="CBD5E1" w:sz="4"/>
+            </w:tcBorders>
+            <w:shd w:fill="F8FAFC" w:color="auto" w:val="clear"/>
+            <w:tcMar>
+              <w:top w:type="dxa" w:w="70"/>
+              <w:left w:type="dxa" w:w="110"/>
+              <w:bottom w:type="dxa" w:w="70"/>
+              <w:right w:type="dxa" w:w="110"/>
+            </w:tcMar>
+          </w:tcPr>
+          <w:p>
+            <w:pPr>
+              <w:spacing w:after="0" w:line="264"/>
+            </w:pPr>
+            <w:r>
+              <w:rPr>
+                <w:b w:val="false"/>
+                <w:bCs w:val="false"/>
+                <w:color w:val="0F172A"/>
+                <w:sz w:val="19"/>
+                <w:szCs w:val="19"/>
+              </w:rPr>
+              <w:t xml:space="preserve">Record purchases from vendors; receiving them adds to stock.</w:t>
+            </w:r>
+          </w:p>
+        </w:tc>
+      </w:tr>
+    </w:tbl>
     <w:p>
       <w:pPr>
         <w:keepNext/>
@@ -5094,7 +5598,7 @@
           <wp:inline distT="0" distB="0" distL="0" distR="0">
             <wp:extent cx="5715000" cy="3571875"/>
             <wp:effectExtent t="0" r="0" b="0" l="0"/>
-            <wp:docPr id="25" name="ug-admin-employees.jpg" descr="ug admin employees jpg" title="ug-admin-employees.jpg"/>
+            <wp:docPr id="25" name="ug-admin-plans.jpg" descr="ug admin plans jpg" title="ug-admin-plans.jpg"/>
             <wp:cNvGraphicFramePr>
               <a:graphicFrameLocks xmlns:a="http://schemas.openxmlformats.org/drawingml/2006/main" noChangeAspect="1"/>
             </wp:cNvGraphicFramePr>
@@ -5143,7 +5647,7 @@
           <w:sz w:val="18"/>
           <w:szCs w:val="18"/>
         </w:rPr>
-        <w:t xml:space="preserve">Figure 24 - Employees and their roles</w:t>
+        <w:t xml:space="preserve">Figure 24 - Managing plans</w:t>
       </w:r>
     </w:p>
     <w:p>
@@ -5157,7 +5661,7 @@
           <wp:inline distT="0" distB="0" distL="0" distR="0">
             <wp:extent cx="5715000" cy="3571875"/>
             <wp:effectExtent t="0" r="0" b="0" l="0"/>
-            <wp:docPr id="26" name="ug-admin-products.jpg" descr="ug admin products jpg" title="ug-admin-products.jpg"/>
+            <wp:docPr id="26" name="ug-admin-employees.jpg" descr="ug admin employees jpg" title="ug-admin-employees.jpg"/>
             <wp:cNvGraphicFramePr>
               <a:graphicFrameLocks xmlns:a="http://schemas.openxmlformats.org/drawingml/2006/main" noChangeAspect="1"/>
             </wp:cNvGraphicFramePr>
@@ -5206,75 +5710,7 @@
           <w:sz w:val="18"/>
           <w:szCs w:val="18"/>
         </w:rPr>
-        <w:t xml:space="preserve">Figure 25 - Products and stock</w:t>
-      </w:r>
-    </w:p>
-    <w:p>
-      <w:pPr>
-        <w:pStyle w:val="Heading2"/>
-      </w:pPr>
-      <w:r>
-        <w:t xml:space="preserve">8.2 Operations</w:t>
-      </w:r>
-    </w:p>
-    <w:p>
-      <w:pPr>
-        <w:pStyle w:val="ListParagraph"/>
-        <w:numPr>
-          <w:ilvl w:val="0"/>
-          <w:numId w:val="3"/>
-        </w:numPr>
-        <w:spacing w:after="60" w:line="276"/>
-      </w:pPr>
-      <w:r>
-        <w:rPr>
-          <w:b/>
-          <w:bCs/>
-        </w:rPr>
-        <w:t xml:space="preserve">Orders</w:t>
-      </w:r>
-      <w:r>
-        <w:t xml:space="preserve"> - every order in every city and its progress.</w:t>
-      </w:r>
-    </w:p>
-    <w:p>
-      <w:pPr>
-        <w:pStyle w:val="ListParagraph"/>
-        <w:numPr>
-          <w:ilvl w:val="0"/>
-          <w:numId w:val="3"/>
-        </w:numPr>
-        <w:spacing w:after="60" w:line="276"/>
-      </w:pPr>
-      <w:r>
-        <w:rPr>
-          <w:b/>
-          <w:bCs/>
-        </w:rPr>
-        <w:t xml:space="preserve">Advanced search</w:t>
-      </w:r>
-      <w:r>
-        <w:t xml:space="preserve"> - find orders and connections by ID, customer name, contact number, type or date.</w:t>
-      </w:r>
-    </w:p>
-    <w:p>
-      <w:pPr>
-        <w:pStyle w:val="ListParagraph"/>
-        <w:numPr>
-          <w:ilvl w:val="0"/>
-          <w:numId w:val="3"/>
-        </w:numPr>
-        <w:spacing w:after="60" w:line="276"/>
-      </w:pPr>
-      <w:r>
-        <w:rPr>
-          <w:b/>
-          <w:bCs/>
-        </w:rPr>
-        <w:t xml:space="preserve">Reports &amp; feedback</w:t>
-      </w:r>
-      <w:r>
-        <w:t xml:space="preserve"> - orders, connections, billing, equipment demand, low stock and customer feedback.</w:t>
+        <w:t xml:space="preserve">Figure 25 - Employees and their roles</w:t>
       </w:r>
     </w:p>
     <w:p>
@@ -5288,7 +5724,7 @@
           <wp:inline distT="0" distB="0" distL="0" distR="0">
             <wp:extent cx="5715000" cy="3571875"/>
             <wp:effectExtent t="0" r="0" b="0" l="0"/>
-            <wp:docPr id="27" name="ui-admin-search.jpg" descr="ui admin search jpg" title="ui-admin-search.jpg"/>
+            <wp:docPr id="27" name="ug-admin-products.jpg" descr="ug admin products jpg" title="ug-admin-products.jpg"/>
             <wp:cNvGraphicFramePr>
               <a:graphicFrameLocks xmlns:a="http://schemas.openxmlformats.org/drawingml/2006/main" noChangeAspect="1"/>
             </wp:cNvGraphicFramePr>
@@ -5337,7 +5773,75 @@
           <w:sz w:val="18"/>
           <w:szCs w:val="18"/>
         </w:rPr>
-        <w:t xml:space="preserve">Figure 26 - Advanced search</w:t>
+        <w:t xml:space="preserve">Figure 26 - Products and stock</w:t>
+      </w:r>
+    </w:p>
+    <w:p>
+      <w:pPr>
+        <w:pStyle w:val="Heading2"/>
+      </w:pPr>
+      <w:r>
+        <w:t xml:space="preserve">8.2 Operations</w:t>
+      </w:r>
+    </w:p>
+    <w:p>
+      <w:pPr>
+        <w:pStyle w:val="ListParagraph"/>
+        <w:numPr>
+          <w:ilvl w:val="0"/>
+          <w:numId w:val="3"/>
+        </w:numPr>
+        <w:spacing w:after="60" w:line="276"/>
+      </w:pPr>
+      <w:r>
+        <w:rPr>
+          <w:b/>
+          <w:bCs/>
+        </w:rPr>
+        <w:t xml:space="preserve">Orders</w:t>
+      </w:r>
+      <w:r>
+        <w:t xml:space="preserve"> - every order in every city and its progress.</w:t>
+      </w:r>
+    </w:p>
+    <w:p>
+      <w:pPr>
+        <w:pStyle w:val="ListParagraph"/>
+        <w:numPr>
+          <w:ilvl w:val="0"/>
+          <w:numId w:val="3"/>
+        </w:numPr>
+        <w:spacing w:after="60" w:line="276"/>
+      </w:pPr>
+      <w:r>
+        <w:rPr>
+          <w:b/>
+          <w:bCs/>
+        </w:rPr>
+        <w:t xml:space="preserve">Advanced search</w:t>
+      </w:r>
+      <w:r>
+        <w:t xml:space="preserve"> - find orders and connections by ID, customer name, contact number, type or date.</w:t>
+      </w:r>
+    </w:p>
+    <w:p>
+      <w:pPr>
+        <w:pStyle w:val="ListParagraph"/>
+        <w:numPr>
+          <w:ilvl w:val="0"/>
+          <w:numId w:val="3"/>
+        </w:numPr>
+        <w:spacing w:after="60" w:line="276"/>
+      </w:pPr>
+      <w:r>
+        <w:rPr>
+          <w:b/>
+          <w:bCs/>
+        </w:rPr>
+        <w:t xml:space="preserve">Reports &amp; feedback</w:t>
+      </w:r>
+      <w:r>
+        <w:t xml:space="preserve"> - orders, connections, billing, equipment demand, low stock and customer feedback.</w:t>
       </w:r>
     </w:p>
     <w:p>
@@ -5351,7 +5855,7 @@
           <wp:inline distT="0" distB="0" distL="0" distR="0">
             <wp:extent cx="5715000" cy="3571875"/>
             <wp:effectExtent t="0" r="0" b="0" l="0"/>
-            <wp:docPr id="28" name="ui-admin-reports.jpg" descr="ui admin reports jpg" title="ui-admin-reports.jpg"/>
+            <wp:docPr id="28" name="ui-admin-search.jpg" descr="ui admin search jpg" title="ui-admin-search.jpg"/>
             <wp:cNvGraphicFramePr>
               <a:graphicFrameLocks xmlns:a="http://schemas.openxmlformats.org/drawingml/2006/main" noChangeAspect="1"/>
             </wp:cNvGraphicFramePr>
@@ -5400,7 +5904,70 @@
           <w:sz w:val="18"/>
           <w:szCs w:val="18"/>
         </w:rPr>
-        <w:t xml:space="preserve">Figure 27 - Reports</w:t>
+        <w:t xml:space="preserve">Figure 27 - Advanced search</w:t>
+      </w:r>
+    </w:p>
+    <w:p>
+      <w:pPr>
+        <w:keepNext/>
+        <w:spacing w:after="60" w:before="120"/>
+        <w:jc w:val="center"/>
+      </w:pPr>
+      <w:r>
+        <w:drawing>
+          <wp:inline distT="0" distB="0" distL="0" distR="0">
+            <wp:extent cx="5715000" cy="3571875"/>
+            <wp:effectExtent t="0" r="0" b="0" l="0"/>
+            <wp:docPr id="29" name="ui-admin-reports.jpg" descr="ui admin reports jpg" title="ui-admin-reports.jpg"/>
+            <wp:cNvGraphicFramePr>
+              <a:graphicFrameLocks xmlns:a="http://schemas.openxmlformats.org/drawingml/2006/main" noChangeAspect="1"/>
+            </wp:cNvGraphicFramePr>
+            <a:graphic xmlns:a="http://schemas.openxmlformats.org/drawingml/2006/main">
+              <a:graphicData uri="http://schemas.openxmlformats.org/drawingml/2006/picture">
+                <pic:pic xmlns:pic="http://schemas.openxmlformats.org/drawingml/2006/picture">
+                  <pic:nvPicPr>
+                    <pic:cNvPr id="0" name="" descr=""/>
+                    <pic:cNvPicPr>
+                      <a:picLocks noChangeAspect="1" noChangeArrowheads="1"/>
+                    </pic:cNvPicPr>
+                  </pic:nvPicPr>
+                  <pic:blipFill>
+                    <a:blip r:embed="rId36" cstate="none"/>
+                    <a:srcRect/>
+                    <a:stretch>
+                      <a:fillRect/>
+                    </a:stretch>
+                  </pic:blipFill>
+                  <pic:spPr bwMode="auto">
+                    <a:xfrm>
+                      <a:off x="0" y="0"/>
+                      <a:ext cx="5715000" cy="3571875"/>
+                    </a:xfrm>
+                    <a:prstGeom prst="rect">
+                      <a:avLst/>
+                    </a:prstGeom>
+                  </pic:spPr>
+                </pic:pic>
+              </a:graphicData>
+            </a:graphic>
+          </wp:inline>
+        </w:drawing>
+      </w:r>
+    </w:p>
+    <w:p>
+      <w:pPr>
+        <w:spacing w:after="240" w:before="60"/>
+        <w:jc w:val="center"/>
+      </w:pPr>
+      <w:r>
+        <w:rPr>
+          <w:i/>
+          <w:iCs/>
+          <w:color w:val="475569"/>
+          <w:sz w:val="18"/>
+          <w:szCs w:val="18"/>
+        </w:rPr>
+        <w:t xml:space="preserve">Figure 28 - Reports</w:t>
       </w:r>
     </w:p>
     <w:p>
@@ -7690,7 +8257,7 @@
         <w:sz w:val="17"/>
         <w:szCs w:val="17"/>
       </w:rPr>
-      <w:t xml:space="preserve">eProject  ·  [Batch] / [Group]</w:t>
+      <w:t xml:space="preserve">eProject  ·  Group of 5  ·  October 2026</w:t>
     </w:r>
     <w:r>
       <w:rPr>

</xml_diff>

<commit_message>
User guide: correct payment and feasibility wording; add team role preparation guide
Co-Authored-By: Claude Opus 5.5 <noreply@anthropic.com>
Claude-Session: https://claude.ai/code/session_01EGrnzrfHztmX7RAaosfXYG
</commit_message>
<xml_diff>
--- a/documentation/Nexus_Documentation/Nexus_User_Guide.docx
+++ b/documentation/Nexus_Documentation/Nexus_User_Guide.docx
@@ -4477,7 +4477,7 @@
         <w:spacing w:after="60" w:line="276"/>
       </w:pPr>
       <w:r>
-        <w:t xml:space="preserve">The bill status changes to Partially paid or Paid. Earlier unpaid bills are paid first.</w:t>
+        <w:t xml:space="preserve">The payment is recorded against that bill and cannot be more than the amount still due on it. The bill status changes to Partially paid or Paid.</w:t>
       </w:r>
     </w:p>
     <w:p>
@@ -4666,7 +4666,7 @@
         <w:t xml:space="preserve">Start checks</w:t>
       </w:r>
       <w:r>
-        <w:t xml:space="preserve"> on an order. A distance check and a server-capacity check are created.</w:t>
+        <w:t xml:space="preserve"> on an order. The system creates the checks the order needs: a landline check (Telephone), an internet check (Broadband), or both (Dial-Up with a new landline).</w:t>
       </w:r>
     </w:p>
     <w:p>

</xml_diff>